<commit_message>
The initial draft of the Testing Plan document has been drawn up and sent out for review. The MTR document has been started.
</commit_message>
<xml_diff>
--- a/docs/draft/02_analysis/es/(V) 20260202 Mexus - SRS (Software Requirements Specifications) v1.0.0.docx
+++ b/docs/draft/02_analysis/es/(V) 20260202 Mexus - SRS (Software Requirements Specifications) v1.0.0.docx
@@ -149,6 +149,7 @@
                                       <w:sz w:val="44"/>
                                     </w:rPr>
                                   </w:pPr>
+                                  <w:proofErr w:type="spellStart"/>
                                   <w:r>
                                     <w:rPr>
                                       <w:color w:val="FFFFFF" w:themeColor="background1"/>
@@ -156,6 +157,7 @@
                                     </w:rPr>
                                     <w:t>Mexus</w:t>
                                   </w:r>
+                                  <w:proofErr w:type="spellEnd"/>
                                 </w:p>
                                 <w:p>
                                   <w:pPr>
@@ -756,28 +758,16 @@
     <w:p>
       <w:pPr>
         <w:pStyle w:val="Ttulo1"/>
-        <w:rPr>
-          <w:rFonts w:asciiTheme="minorHAnsi" w:hAnsiTheme="minorHAnsi" w:cstheme="minorHAnsi"/>
-        </w:rPr>
       </w:pPr>
       <w:bookmarkStart w:id="0" w:name="_ÍNDICE"/>
       <w:bookmarkEnd w:id="0"/>
       <w:r>
-        <w:rPr>
-          <w:rFonts w:asciiTheme="minorHAnsi" w:hAnsiTheme="minorHAnsi" w:cstheme="minorHAnsi"/>
-        </w:rPr>
         <w:t>ESP</w:t>
       </w:r>
       <w:r>
-        <w:rPr>
-          <w:rFonts w:asciiTheme="minorHAnsi" w:hAnsiTheme="minorHAnsi" w:cstheme="minorHAnsi"/>
-        </w:rPr>
         <w:t>E</w:t>
       </w:r>
       <w:r>
-        <w:rPr>
-          <w:rFonts w:asciiTheme="minorHAnsi" w:hAnsiTheme="minorHAnsi" w:cstheme="minorHAnsi"/>
-        </w:rPr>
         <w:t>CIFICACIONES DE REQUISITOS DE SOFTWARE</w:t>
       </w:r>
     </w:p>
@@ -830,12 +820,14 @@
                 <w:color w:val="auto"/>
               </w:rPr>
             </w:pPr>
+            <w:proofErr w:type="spellStart"/>
             <w:r>
               <w:rPr>
                 <w:color w:val="auto"/>
               </w:rPr>
               <w:t>Mexus</w:t>
             </w:r>
+            <w:proofErr w:type="spellEnd"/>
           </w:p>
         </w:tc>
       </w:tr>
@@ -884,7 +876,21 @@
               <w:rPr>
                 <w:color w:val="FFFFFF" w:themeColor="background1"/>
               </w:rPr>
-              <w:t>Corporativo – SRS (IEEE 29148 compliant, light)</w:t>
+              <w:t xml:space="preserve">Corporativo – SRS (IEEE 29148 </w:t>
+            </w:r>
+            <w:proofErr w:type="spellStart"/>
+            <w:r>
+              <w:rPr>
+                <w:color w:val="FFFFFF" w:themeColor="background1"/>
+              </w:rPr>
+              <w:t>compliant</w:t>
+            </w:r>
+            <w:proofErr w:type="spellEnd"/>
+            <w:r>
+              <w:rPr>
+                <w:color w:val="FFFFFF" w:themeColor="background1"/>
+              </w:rPr>
+              <w:t>, light)</w:t>
             </w:r>
           </w:p>
         </w:tc>
@@ -1056,6 +1062,69 @@
               <w:rPr>
                 <w:b/>
                 <w:bCs/>
+                <w:i w:val="0"/>
+                <w:iCs w:val="0"/>
+                <w:color w:val="auto"/>
+              </w:rPr>
+            </w:pPr>
+            <w:r>
+              <w:rPr>
+                <w:b/>
+                <w:bCs/>
+                <w:color w:val="auto"/>
+              </w:rPr>
+              <w:t>Rol</w:t>
+            </w:r>
+          </w:p>
+        </w:tc>
+        <w:tc>
+          <w:tcPr>
+            <w:tcW w:w="7897" w:type="dxa"/>
+            <w:shd w:val="clear" w:color="auto" w:fill="4E91CD"/>
+          </w:tcPr>
+          <w:p>
+            <w:pPr>
+              <w:jc w:val="both"/>
+              <w:cnfStyle w:val="000000100000" w:firstRow="0" w:lastRow="0" w:firstColumn="0" w:lastColumn="0" w:oddVBand="0" w:evenVBand="0" w:oddHBand="1" w:evenHBand="0" w:firstRowFirstColumn="0" w:firstRowLastColumn="0" w:lastRowFirstColumn="0" w:lastRowLastColumn="0"/>
+              <w:rPr>
+                <w:b/>
+                <w:bCs/>
+                <w:color w:val="auto"/>
+              </w:rPr>
+            </w:pPr>
+            <w:r>
+              <w:rPr>
+                <w:b/>
+                <w:bCs/>
+                <w:color w:val="FFFFFF" w:themeColor="background1"/>
+              </w:rPr>
+              <w:t>PO/</w:t>
+            </w:r>
+            <w:proofErr w:type="spellStart"/>
+            <w:r>
+              <w:rPr>
+                <w:b/>
+                <w:bCs/>
+                <w:color w:val="FFFFFF" w:themeColor="background1"/>
+              </w:rPr>
+              <w:t>Analyst</w:t>
+            </w:r>
+            <w:proofErr w:type="spellEnd"/>
+          </w:p>
+        </w:tc>
+      </w:tr>
+      <w:tr>
+        <w:tc>
+          <w:tcPr>
+            <w:cnfStyle w:val="001000000000" w:firstRow="0" w:lastRow="0" w:firstColumn="1" w:lastColumn="0" w:oddVBand="0" w:evenVBand="0" w:oddHBand="0" w:evenHBand="0" w:firstRowFirstColumn="0" w:firstRowLastColumn="0" w:lastRowFirstColumn="0" w:lastRowLastColumn="0"/>
+            <w:tcW w:w="2077" w:type="dxa"/>
+          </w:tcPr>
+          <w:p>
+            <w:pPr>
+              <w:jc w:val="both"/>
+              <w:rPr>
+                <w:b/>
+                <w:bCs/>
                 <w:color w:val="auto"/>
               </w:rPr>
             </w:pPr>
@@ -1072,19 +1141,18 @@
         <w:tc>
           <w:tcPr>
             <w:tcW w:w="7897" w:type="dxa"/>
-            <w:shd w:val="clear" w:color="auto" w:fill="4E91CD"/>
           </w:tcPr>
           <w:p>
             <w:pPr>
               <w:jc w:val="both"/>
-              <w:cnfStyle w:val="000000100000" w:firstRow="0" w:lastRow="0" w:firstColumn="0" w:lastColumn="0" w:oddVBand="0" w:evenVBand="0" w:oddHBand="1" w:evenHBand="0" w:firstRowFirstColumn="0" w:firstRowLastColumn="0" w:lastRowFirstColumn="0" w:lastRowLastColumn="0"/>
+              <w:cnfStyle w:val="000000000000" w:firstRow="0" w:lastRow="0" w:firstColumn="0" w:lastColumn="0" w:oddVBand="0" w:evenVBand="0" w:oddHBand="0" w:evenHBand="0" w:firstRowFirstColumn="0" w:firstRowLastColumn="0" w:lastRowFirstColumn="0" w:lastRowLastColumn="0"/>
               <w:rPr>
                 <w:color w:val="FFFFFF" w:themeColor="background1"/>
               </w:rPr>
             </w:pPr>
             <w:r>
               <w:rPr>
-                <w:color w:val="FFFFFF" w:themeColor="background1"/>
+                <w:color w:val="auto"/>
               </w:rPr>
               <w:t>David Cueli</w:t>
             </w:r>
@@ -1097,26 +1165,16 @@
     <w:p>
       <w:pPr>
         <w:pStyle w:val="Ttulo1"/>
-        <w:rPr>
-          <w:rFonts w:asciiTheme="minorHAnsi" w:hAnsiTheme="minorHAnsi" w:cstheme="minorHAnsi"/>
-        </w:rPr>
       </w:pPr>
       <w:bookmarkStart w:id="1" w:name="_ÍNDICE_1"/>
       <w:bookmarkEnd w:id="1"/>
       <w:r>
-        <w:rPr>
-          <w:rFonts w:asciiTheme="minorHAnsi" w:hAnsiTheme="minorHAnsi" w:cstheme="minorHAnsi"/>
-        </w:rPr>
         <w:t>ÍNDICE</w:t>
       </w:r>
     </w:p>
     <w:p>
       <w:pPr>
         <w:pStyle w:val="Subttulo"/>
-        <w:ind w:firstLine="0"/>
-        <w:rPr>
-          <w:rFonts w:asciiTheme="minorHAnsi" w:hAnsiTheme="minorHAnsi" w:cstheme="minorHAnsi"/>
-        </w:rPr>
       </w:pPr>
     </w:p>
     <w:p>
@@ -1130,8 +1188,6 @@
         <w:rPr>
           <w:rStyle w:val="Hipervnculo"/>
           <w:rFonts w:cstheme="minorHAnsi"/>
-          <w:i/>
-          <w:iCs/>
         </w:rPr>
       </w:pPr>
       <w:hyperlink w:anchor="_CONTROL_DE_VERSIONES" w:history="1">
@@ -1139,8 +1195,6 @@
           <w:rPr>
             <w:rStyle w:val="Hipervnculo"/>
             <w:rFonts w:cstheme="minorHAnsi"/>
-            <w:i/>
-            <w:iCs/>
           </w:rPr>
           <w:t>Control de versiones</w:t>
         </w:r>
@@ -1160,8 +1214,6 @@
           <w:rPr>
             <w:rStyle w:val="Hipervnculo"/>
             <w:rFonts w:cstheme="minorHAnsi"/>
-            <w:i/>
-            <w:iCs/>
           </w:rPr>
           <w:t>Introducción</w:t>
         </w:r>
@@ -1319,12 +1371,14 @@
         <w:jc w:val="both"/>
       </w:pPr>
       <w:hyperlink w:anchor="_Problema_a_resolver" w:history="1">
+        <w:proofErr w:type="gramStart"/>
         <w:r>
           <w:rPr>
             <w:rStyle w:val="Hipervnculo"/>
           </w:rPr>
           <w:t>Problema a resolver</w:t>
         </w:r>
+        <w:proofErr w:type="gramEnd"/>
       </w:hyperlink>
     </w:p>
     <w:p>
@@ -1432,11 +1486,19 @@
         <w:jc w:val="both"/>
       </w:pPr>
       <w:hyperlink w:anchor="_Stakeholders_y_necesidades" w:history="1">
+        <w:proofErr w:type="spellStart"/>
         <w:r>
           <w:rPr>
             <w:rStyle w:val="Hipervnculo"/>
           </w:rPr>
-          <w:t>Stakeholders y necesidades</w:t>
+          <w:t>Stakeholders</w:t>
+        </w:r>
+        <w:proofErr w:type="spellEnd"/>
+        <w:r>
+          <w:rPr>
+            <w:rStyle w:val="Hipervnculo"/>
+          </w:rPr>
+          <w:t xml:space="preserve"> y necesidades</w:t>
         </w:r>
       </w:hyperlink>
     </w:p>
@@ -1455,8 +1517,16 @@
           <w:rPr>
             <w:rStyle w:val="Hipervnculo"/>
           </w:rPr>
-          <w:t>Identificación de stakeholders</w:t>
+          <w:t xml:space="preserve">Identificación de </w:t>
         </w:r>
+        <w:proofErr w:type="spellStart"/>
+        <w:r>
+          <w:rPr>
+            <w:rStyle w:val="Hipervnculo"/>
+          </w:rPr>
+          <w:t>stakeholders</w:t>
+        </w:r>
+        <w:proofErr w:type="spellEnd"/>
       </w:hyperlink>
     </w:p>
     <w:p>
@@ -1512,8 +1582,16 @@
           <w:rPr>
             <w:rStyle w:val="Hipervnculo"/>
           </w:rPr>
-          <w:t>Conflictos y prioridades entre stakeholders</w:t>
+          <w:t xml:space="preserve">Conflictos y prioridades entre </w:t>
         </w:r>
+        <w:proofErr w:type="spellStart"/>
+        <w:r>
+          <w:rPr>
+            <w:rStyle w:val="Hipervnculo"/>
+          </w:rPr>
+          <w:t>stakeholders</w:t>
+        </w:r>
+        <w:proofErr w:type="spellEnd"/>
       </w:hyperlink>
     </w:p>
     <w:p>
@@ -1725,7 +1803,19 @@
           <w:rPr>
             <w:rStyle w:val="Hipervnculo"/>
           </w:rPr>
-          <w:t>Requisitos funcionales</w:t>
+          <w:t xml:space="preserve">Requisitos </w:t>
+        </w:r>
+        <w:r>
+          <w:rPr>
+            <w:rStyle w:val="Hipervnculo"/>
+          </w:rPr>
+          <w:t>f</w:t>
+        </w:r>
+        <w:r>
+          <w:rPr>
+            <w:rStyle w:val="Hipervnculo"/>
+          </w:rPr>
+          <w:t>uncionales</w:t>
         </w:r>
       </w:hyperlink>
     </w:p>
@@ -2095,7 +2185,21 @@
           <w:rPr>
             <w:rStyle w:val="Hipervnculo"/>
           </w:rPr>
-          <w:t>Arquitectura y stack tecnológico</w:t>
+          <w:t xml:space="preserve">Arquitectura y </w:t>
+        </w:r>
+        <w:proofErr w:type="spellStart"/>
+        <w:r>
+          <w:rPr>
+            <w:rStyle w:val="Hipervnculo"/>
+          </w:rPr>
+          <w:t>stack</w:t>
+        </w:r>
+        <w:proofErr w:type="spellEnd"/>
+        <w:r>
+          <w:rPr>
+            <w:rStyle w:val="Hipervnculo"/>
+          </w:rPr>
+          <w:t xml:space="preserve"> tecnológico</w:t>
         </w:r>
       </w:hyperlink>
     </w:p>
@@ -2607,7 +2711,35 @@
           <w:rPr>
             <w:rStyle w:val="Hipervnculo"/>
           </w:rPr>
-          <w:t>Fuera de alcance (Out of Scope)</w:t>
+          <w:t>Fuera de alcance (</w:t>
+        </w:r>
+        <w:proofErr w:type="spellStart"/>
+        <w:r>
+          <w:rPr>
+            <w:rStyle w:val="Hipervnculo"/>
+          </w:rPr>
+          <w:t>Out</w:t>
+        </w:r>
+        <w:proofErr w:type="spellEnd"/>
+        <w:r>
+          <w:rPr>
+            <w:rStyle w:val="Hipervnculo"/>
+          </w:rPr>
+          <w:t xml:space="preserve"> </w:t>
+        </w:r>
+        <w:proofErr w:type="spellStart"/>
+        <w:r>
+          <w:rPr>
+            <w:rStyle w:val="Hipervnculo"/>
+          </w:rPr>
+          <w:t>of</w:t>
+        </w:r>
+        <w:proofErr w:type="spellEnd"/>
+        <w:r>
+          <w:rPr>
+            <w:rStyle w:val="Hipervnculo"/>
+          </w:rPr>
+          <w:t xml:space="preserve"> Scope)</w:t>
         </w:r>
       </w:hyperlink>
     </w:p>
@@ -3282,7 +3414,13 @@
               <w:rPr>
                 <w:rStyle w:val="Hipervnculo"/>
               </w:rPr>
-              <w:t>1.0</w:t>
+              <w:t>0.1.</w:t>
+            </w:r>
+            <w:r>
+              <w:rPr>
+                <w:rStyle w:val="Hipervnculo"/>
+              </w:rPr>
+              <w:t>0</w:t>
             </w:r>
             <w:bookmarkEnd w:id="4"/>
             <w:r>
@@ -3702,6 +3840,7 @@
                 <w:szCs w:val="18"/>
               </w:rPr>
             </w:pPr>
+            <w:proofErr w:type="gramStart"/>
             <w:r>
               <w:rPr>
                 <w:rFonts w:cstheme="minorHAnsi"/>
@@ -3710,6 +3849,7 @@
               </w:rPr>
               <w:t>Problema a resolver</w:t>
             </w:r>
+            <w:proofErr w:type="gramEnd"/>
           </w:p>
           <w:p>
             <w:pPr>
@@ -3933,13 +4073,23 @@
                 <w:szCs w:val="18"/>
               </w:rPr>
             </w:pPr>
+            <w:proofErr w:type="spellStart"/>
             <w:r>
               <w:rPr>
                 <w:rFonts w:cstheme="minorHAnsi"/>
                 <w:sz w:val="18"/>
                 <w:szCs w:val="18"/>
               </w:rPr>
-              <w:t>Stakeholders y necesidades</w:t>
+              <w:t>Stakeholders</w:t>
+            </w:r>
+            <w:proofErr w:type="spellEnd"/>
+            <w:r>
+              <w:rPr>
+                <w:rFonts w:cstheme="minorHAnsi"/>
+                <w:sz w:val="18"/>
+                <w:szCs w:val="18"/>
+              </w:rPr>
+              <w:t xml:space="preserve"> y necesidades</w:t>
             </w:r>
           </w:p>
           <w:p>
@@ -3963,8 +4113,18 @@
                 <w:sz w:val="18"/>
                 <w:szCs w:val="18"/>
               </w:rPr>
-              <w:t>Identificación de stakeholders</w:t>
+              <w:t xml:space="preserve">Identificación de </w:t>
             </w:r>
+            <w:proofErr w:type="spellStart"/>
+            <w:r>
+              <w:rPr>
+                <w:rFonts w:cstheme="minorHAnsi"/>
+                <w:sz w:val="18"/>
+                <w:szCs w:val="18"/>
+              </w:rPr>
+              <w:t>stakeholders</w:t>
+            </w:r>
+            <w:proofErr w:type="spellEnd"/>
           </w:p>
           <w:p>
             <w:pPr>
@@ -4035,8 +4195,18 @@
                 <w:sz w:val="18"/>
                 <w:szCs w:val="18"/>
               </w:rPr>
-              <w:t>Conflictos y prioridades entre stakeholders</w:t>
+              <w:t xml:space="preserve">Conflictos y prioridades entre </w:t>
             </w:r>
+            <w:proofErr w:type="spellStart"/>
+            <w:r>
+              <w:rPr>
+                <w:rFonts w:cstheme="minorHAnsi"/>
+                <w:sz w:val="18"/>
+                <w:szCs w:val="18"/>
+              </w:rPr>
+              <w:t>stakeholders</w:t>
+            </w:r>
+            <w:proofErr w:type="spellEnd"/>
           </w:p>
           <w:p>
             <w:pPr>
@@ -4633,7 +4803,43 @@
                 <w:sz w:val="18"/>
                 <w:szCs w:val="18"/>
               </w:rPr>
-              <w:t>Fuera de alcance (Out of Scope)</w:t>
+              <w:t>Fuera de alcance (</w:t>
+            </w:r>
+            <w:proofErr w:type="spellStart"/>
+            <w:r>
+              <w:rPr>
+                <w:rFonts w:cstheme="minorHAnsi"/>
+                <w:sz w:val="18"/>
+                <w:szCs w:val="18"/>
+              </w:rPr>
+              <w:t>Out</w:t>
+            </w:r>
+            <w:proofErr w:type="spellEnd"/>
+            <w:r>
+              <w:rPr>
+                <w:rFonts w:cstheme="minorHAnsi"/>
+                <w:sz w:val="18"/>
+                <w:szCs w:val="18"/>
+              </w:rPr>
+              <w:t xml:space="preserve"> </w:t>
+            </w:r>
+            <w:proofErr w:type="spellStart"/>
+            <w:r>
+              <w:rPr>
+                <w:rFonts w:cstheme="minorHAnsi"/>
+                <w:sz w:val="18"/>
+                <w:szCs w:val="18"/>
+              </w:rPr>
+              <w:t>of</w:t>
+            </w:r>
+            <w:proofErr w:type="spellEnd"/>
+            <w:r>
+              <w:rPr>
+                <w:rFonts w:cstheme="minorHAnsi"/>
+                <w:sz w:val="18"/>
+                <w:szCs w:val="18"/>
+              </w:rPr>
+              <w:t xml:space="preserve"> Scope)</w:t>
             </w:r>
           </w:p>
           <w:p>
@@ -5013,9 +5219,6 @@
       <w:r>
         <w:rPr>
           <w:rFonts w:cs="Calibri Light"/>
-          <w:caps w:val="0"/>
-          <w:sz w:val="18"/>
-          <w:szCs w:val="18"/>
         </w:rPr>
         <w:t xml:space="preserve"> </w:t>
       </w:r>
@@ -5112,6 +5315,7 @@
       <w:r>
         <w:t xml:space="preserve"> del proyecto </w:t>
       </w:r>
+      <w:proofErr w:type="spellStart"/>
       <w:r>
         <w:rPr>
           <w:b/>
@@ -5119,6 +5323,7 @@
         </w:rPr>
         <w:t>Mexus</w:t>
       </w:r>
+      <w:proofErr w:type="spellEnd"/>
       <w:r>
         <w:t xml:space="preserve"> en su</w:t>
       </w:r>
@@ -5230,6 +5435,7 @@
       <w:r>
         <w:t xml:space="preserve"> de </w:t>
       </w:r>
+      <w:proofErr w:type="spellStart"/>
       <w:r>
         <w:rPr>
           <w:b/>
@@ -5237,6 +5443,7 @@
         </w:rPr>
         <w:t>Mexus</w:t>
       </w:r>
+      <w:proofErr w:type="spellEnd"/>
       <w:r>
         <w:t>, garantizando que todas las decisiones técnicas y funcionales se bas</w:t>
       </w:r>
@@ -5343,6 +5550,7 @@
       <w:pPr>
         <w:jc w:val="both"/>
       </w:pPr>
+      <w:proofErr w:type="spellStart"/>
       <w:r>
         <w:rPr>
           <w:b/>
@@ -5350,6 +5558,7 @@
         </w:rPr>
         <w:t>Mexus</w:t>
       </w:r>
+      <w:proofErr w:type="spellEnd"/>
       <w:r>
         <w:t xml:space="preserve"> tiene como objetivo</w:t>
       </w:r>
@@ -5397,6 +5606,7 @@
       <w:r>
         <w:t xml:space="preserve"> de </w:t>
       </w:r>
+      <w:proofErr w:type="spellStart"/>
       <w:r>
         <w:rPr>
           <w:b/>
@@ -5404,6 +5614,7 @@
         </w:rPr>
         <w:t>Mexus</w:t>
       </w:r>
+      <w:proofErr w:type="spellEnd"/>
       <w:r>
         <w:t xml:space="preserve"> se centra en ofrecer un </w:t>
       </w:r>
@@ -5537,7 +5748,15 @@
         <w:jc w:val="both"/>
       </w:pPr>
       <w:r>
-        <w:t>Imposibilitar, en la medida de las posibilidades del SO la acción voluntaria o no, de exportación, compartir y/o distribuir, divulgar, etc; para las grabaciones hechas de las llamadas con la apli</w:t>
+        <w:t xml:space="preserve">Imposibilitar, en la medida de las posibilidades del SO la acción voluntaria o no, de exportación, compartir y/o distribuir, divulgar, </w:t>
+      </w:r>
+      <w:proofErr w:type="spellStart"/>
+      <w:r>
+        <w:t>etc</w:t>
+      </w:r>
+      <w:proofErr w:type="spellEnd"/>
+      <w:r>
+        <w:t>; para las grabaciones hechas de las llamadas con la apli</w:t>
       </w:r>
       <w:r>
         <w:t>ca</w:t>
@@ -5586,6 +5805,7 @@
       <w:r>
         <w:t xml:space="preserve"> se contempla ningún tipo de </w:t>
       </w:r>
+      <w:proofErr w:type="spellStart"/>
       <w:r>
         <w:t>B</w:t>
       </w:r>
@@ -5596,7 +5816,11 @@
         <w:t>E</w:t>
       </w:r>
       <w:r>
-        <w:t>nd, servicio remoto, almacenamiento en la nube,</w:t>
+        <w:t>nd</w:t>
+      </w:r>
+      <w:proofErr w:type="spellEnd"/>
+      <w:r>
+        <w:t>, servicio remoto, almacenamiento en la nube,</w:t>
       </w:r>
       <w:r>
         <w:t xml:space="preserve"> </w:t>
@@ -5625,9 +5849,11 @@
       <w:pPr>
         <w:pStyle w:val="Ttulo3"/>
       </w:pPr>
+      <w:proofErr w:type="spellStart"/>
       <w:r>
         <w:t>Mexus</w:t>
       </w:r>
+      <w:proofErr w:type="spellEnd"/>
     </w:p>
     <w:p>
       <w:pPr>
@@ -5658,6 +5884,7 @@
       <w:r>
         <w:t xml:space="preserve">Organización responsable del proyecto </w:t>
       </w:r>
+      <w:proofErr w:type="spellStart"/>
       <w:r>
         <w:rPr>
           <w:b/>
@@ -5665,6 +5892,7 @@
         </w:rPr>
         <w:t>Mexus</w:t>
       </w:r>
+      <w:proofErr w:type="spellEnd"/>
       <w:r>
         <w:t>.</w:t>
       </w:r>
@@ -5685,8 +5913,21 @@
         <w:jc w:val="both"/>
       </w:pPr>
       <w:r>
-        <w:t>Software Requirements Specification</w:t>
-      </w:r>
+        <w:t xml:space="preserve">Software </w:t>
+      </w:r>
+      <w:proofErr w:type="spellStart"/>
+      <w:r>
+        <w:t>Requirements</w:t>
+      </w:r>
+      <w:proofErr w:type="spellEnd"/>
+      <w:r>
+        <w:t xml:space="preserve"> </w:t>
+      </w:r>
+      <w:proofErr w:type="spellStart"/>
+      <w:r>
+        <w:t>Specification</w:t>
+      </w:r>
+      <w:proofErr w:type="spellEnd"/>
     </w:p>
     <w:p>
       <w:pPr>
@@ -5740,8 +5981,49 @@
           <w:i/>
           <w:iCs/>
         </w:rPr>
-        <w:t>Must, Should, Could, Won’t</w:t>
-      </w:r>
+        <w:t xml:space="preserve">Must, </w:t>
+      </w:r>
+      <w:proofErr w:type="spellStart"/>
+      <w:r>
+        <w:rPr>
+          <w:i/>
+          <w:iCs/>
+        </w:rPr>
+        <w:t>Should</w:t>
+      </w:r>
+      <w:proofErr w:type="spellEnd"/>
+      <w:r>
+        <w:rPr>
+          <w:i/>
+          <w:iCs/>
+        </w:rPr>
+        <w:t xml:space="preserve">, </w:t>
+      </w:r>
+      <w:proofErr w:type="spellStart"/>
+      <w:r>
+        <w:rPr>
+          <w:i/>
+          <w:iCs/>
+        </w:rPr>
+        <w:t>Could</w:t>
+      </w:r>
+      <w:proofErr w:type="spellEnd"/>
+      <w:r>
+        <w:rPr>
+          <w:i/>
+          <w:iCs/>
+        </w:rPr>
+        <w:t xml:space="preserve">, </w:t>
+      </w:r>
+      <w:proofErr w:type="spellStart"/>
+      <w:r>
+        <w:rPr>
+          <w:i/>
+          <w:iCs/>
+        </w:rPr>
+        <w:t>Won’t</w:t>
+      </w:r>
+      <w:proofErr w:type="spellEnd"/>
       <w:r>
         <w:t>)</w:t>
       </w:r>
@@ -5751,7 +6033,23 @@
         <w:pStyle w:val="Ttulo3"/>
       </w:pPr>
       <w:r>
-        <w:t>MVP (Minimum Viable Product)</w:t>
+        <w:t>MVP (</w:t>
+      </w:r>
+      <w:proofErr w:type="spellStart"/>
+      <w:r>
+        <w:t>Minimum</w:t>
+      </w:r>
+      <w:proofErr w:type="spellEnd"/>
+      <w:r>
+        <w:t xml:space="preserve"> Viable </w:t>
+      </w:r>
+      <w:proofErr w:type="spellStart"/>
+      <w:r>
+        <w:t>Product</w:t>
+      </w:r>
+      <w:proofErr w:type="spellEnd"/>
+      <w:r>
+        <w:t>)</w:t>
       </w:r>
     </w:p>
     <w:p>
@@ -5781,13 +6079,31 @@
         <w:jc w:val="both"/>
       </w:pPr>
       <w:r>
-        <w:t xml:space="preserve">Identificador de requisito (Initial </w:t>
-      </w:r>
-      <w:r>
-        <w:t xml:space="preserve">Functional </w:t>
-      </w:r>
-      <w:r>
-        <w:t>Requirement), donde XX es un número secuencial.</w:t>
+        <w:t>Identificador de requisito (</w:t>
+      </w:r>
+      <w:proofErr w:type="spellStart"/>
+      <w:r>
+        <w:t>Initial</w:t>
+      </w:r>
+      <w:proofErr w:type="spellEnd"/>
+      <w:r>
+        <w:t xml:space="preserve"> </w:t>
+      </w:r>
+      <w:proofErr w:type="spellStart"/>
+      <w:r>
+        <w:t>Functional</w:t>
+      </w:r>
+      <w:proofErr w:type="spellEnd"/>
+      <w:r>
+        <w:t xml:space="preserve"> </w:t>
+      </w:r>
+      <w:proofErr w:type="spellStart"/>
+      <w:r>
+        <w:t>Requirement</w:t>
+      </w:r>
+      <w:proofErr w:type="spellEnd"/>
+      <w:r>
+        <w:t>), donde XX es un número secuencial.</w:t>
       </w:r>
     </w:p>
     <w:p>
@@ -5815,13 +6131,34 @@
         <w:jc w:val="both"/>
       </w:pPr>
       <w:r>
-        <w:t xml:space="preserve">Identificador de requisito (Initial </w:t>
-      </w:r>
-      <w:r>
-        <w:t xml:space="preserve">Non-Functional </w:t>
-      </w:r>
-      <w:r>
-        <w:t>Requirement), donde XX es un número secuencial.</w:t>
+        <w:t>Identificador de requisito (</w:t>
+      </w:r>
+      <w:proofErr w:type="spellStart"/>
+      <w:r>
+        <w:t>Initial</w:t>
+      </w:r>
+      <w:proofErr w:type="spellEnd"/>
+      <w:r>
+        <w:t xml:space="preserve"> </w:t>
+      </w:r>
+      <w:r>
+        <w:t>Non-</w:t>
+      </w:r>
+      <w:proofErr w:type="spellStart"/>
+      <w:r>
+        <w:t>Functional</w:t>
+      </w:r>
+      <w:proofErr w:type="spellEnd"/>
+      <w:r>
+        <w:t xml:space="preserve"> </w:t>
+      </w:r>
+      <w:proofErr w:type="spellStart"/>
+      <w:r>
+        <w:t>Requirement</w:t>
+      </w:r>
+      <w:proofErr w:type="spellEnd"/>
+      <w:r>
+        <w:t>), donde XX es un número secuencial.</w:t>
       </w:r>
     </w:p>
     <w:p>
@@ -5867,8 +6204,13 @@
         <w:t>,</w:t>
       </w:r>
       <w:r>
-        <w:t xml:space="preserve"> Software Requirements</w:t>
-      </w:r>
+        <w:t xml:space="preserve"> Software </w:t>
+      </w:r>
+      <w:proofErr w:type="spellStart"/>
+      <w:r>
+        <w:t>Requirements</w:t>
+      </w:r>
+      <w:proofErr w:type="spellEnd"/>
     </w:p>
     <w:p>
       <w:pPr>
@@ -5891,7 +6233,15 @@
         <w:t>,</w:t>
       </w:r>
       <w:r>
-        <w:t xml:space="preserve"> Quality Model</w:t>
+        <w:t xml:space="preserve"> </w:t>
+      </w:r>
+      <w:proofErr w:type="spellStart"/>
+      <w:r>
+        <w:t>Quality</w:t>
+      </w:r>
+      <w:proofErr w:type="spellEnd"/>
+      <w:r>
+        <w:t xml:space="preserve"> Model</w:t>
       </w:r>
     </w:p>
     <w:p>
@@ -5915,8 +6265,19 @@
           <w:i/>
           <w:iCs/>
         </w:rPr>
-        <w:t>Android Developer Documentation</w:t>
-      </w:r>
+        <w:t xml:space="preserve">Android Developer </w:t>
+      </w:r>
+      <w:proofErr w:type="spellStart"/>
+      <w:r>
+        <w:rPr>
+          <w:b/>
+          <w:bCs/>
+          <w:i/>
+          <w:iCs/>
+        </w:rPr>
+        <w:t>Documentation</w:t>
+      </w:r>
+      <w:proofErr w:type="spellEnd"/>
     </w:p>
     <w:p>
       <w:pPr>
@@ -6025,6 +6386,7 @@
         </w:rPr>
         <w:t xml:space="preserve">riesgos conocidos del sistema </w:t>
       </w:r>
+      <w:proofErr w:type="spellStart"/>
       <w:r>
         <w:rPr>
           <w:b/>
@@ -6034,6 +6396,7 @@
         </w:rPr>
         <w:t>Mexus</w:t>
       </w:r>
+      <w:proofErr w:type="spellEnd"/>
       <w:r>
         <w:t>.</w:t>
       </w:r>
@@ -6090,6 +6453,7 @@
       <w:pPr>
         <w:jc w:val="both"/>
       </w:pPr>
+      <w:proofErr w:type="spellStart"/>
       <w:r>
         <w:rPr>
           <w:b/>
@@ -6097,15 +6461,25 @@
         </w:rPr>
         <w:t>Mexus</w:t>
       </w:r>
+      <w:proofErr w:type="spellEnd"/>
       <w:r>
         <w:t xml:space="preserve"> es una aplicación móvil de grabación de llamadas para Android, diseñada para usuarios que requieren registrar sus llamadas de manera local, segura y controlada, sin necesidad de conexión a servidores externos ni servicios en la nube. La aplicación se desarrollará usando </w:t>
       </w:r>
+      <w:proofErr w:type="spellStart"/>
       <w:r>
         <w:rPr>
           <w:i/>
           <w:iCs/>
         </w:rPr>
-        <w:t>Ionic + Angular</w:t>
+        <w:t>Ionic</w:t>
+      </w:r>
+      <w:proofErr w:type="spellEnd"/>
+      <w:r>
+        <w:rPr>
+          <w:i/>
+          <w:iCs/>
+        </w:rPr>
+        <w:t xml:space="preserve"> + Angular</w:t>
       </w:r>
       <w:r>
         <w:t xml:space="preserve"> para la interfaz y Capacitor para la integración funcionalidades </w:t>
@@ -6130,6 +6504,7 @@
       <w:pPr>
         <w:jc w:val="both"/>
       </w:pPr>
+      <w:proofErr w:type="spellStart"/>
       <w:r>
         <w:rPr>
           <w:b/>
@@ -6137,6 +6512,7 @@
         </w:rPr>
         <w:t>Mexus</w:t>
       </w:r>
+      <w:proofErr w:type="spellEnd"/>
       <w:r>
         <w:t xml:space="preserve"> se concibe como una solución autónoma, sin dependencia de sistemas externos, y su arquitectura permitirá futuras extensiones, como automatización de grabación o compatibilidad con otras plataformas.</w:t>
       </w:r>
@@ -6169,6 +6545,7 @@
       <w:pPr>
         <w:pStyle w:val="Ttulo2"/>
       </w:pPr>
+      <w:proofErr w:type="gramStart"/>
       <w:r>
         <w:lastRenderedPageBreak/>
         <w:t xml:space="preserve">Problema </w:t>
@@ -6179,6 +6556,7 @@
       <w:r>
         <w:t xml:space="preserve"> resolver</w:t>
       </w:r>
+      <w:proofErr w:type="gramEnd"/>
     </w:p>
     <w:p/>
     <w:p>
@@ -6713,7 +7091,23 @@
                 <w:sz w:val="18"/>
                 <w:szCs w:val="18"/>
               </w:rPr>
-              <w:t>Acceso total a código, logging y configuración de desarrollo</w:t>
+              <w:t xml:space="preserve">Acceso total a código, </w:t>
+            </w:r>
+            <w:proofErr w:type="spellStart"/>
+            <w:r>
+              <w:rPr>
+                <w:sz w:val="18"/>
+                <w:szCs w:val="18"/>
+              </w:rPr>
+              <w:t>logging</w:t>
+            </w:r>
+            <w:proofErr w:type="spellEnd"/>
+            <w:r>
+              <w:rPr>
+                <w:sz w:val="18"/>
+                <w:szCs w:val="18"/>
+              </w:rPr>
+              <w:t xml:space="preserve"> y configuración de desarrollo</w:t>
             </w:r>
           </w:p>
         </w:tc>
@@ -6791,8 +7185,18 @@
                 <w:sz w:val="18"/>
                 <w:szCs w:val="18"/>
               </w:rPr>
-              <w:t>Solo revisión de textos legales y checkboxes</w:t>
+              <w:t xml:space="preserve">Solo revisión de textos legales y </w:t>
             </w:r>
+            <w:proofErr w:type="spellStart"/>
+            <w:r>
+              <w:rPr>
+                <w:color w:val="FFFFFF" w:themeColor="background1"/>
+                <w:sz w:val="18"/>
+                <w:szCs w:val="18"/>
+              </w:rPr>
+              <w:t>checkboxes</w:t>
+            </w:r>
+            <w:proofErr w:type="spellEnd"/>
           </w:p>
         </w:tc>
       </w:tr>
@@ -6898,12 +7302,21 @@
         </w:tabs>
         <w:jc w:val="both"/>
       </w:pPr>
+      <w:proofErr w:type="spellStart"/>
       <w:r>
         <w:rPr>
           <w:b/>
           <w:bCs/>
         </w:rPr>
-        <w:t>Ionic + Angular</w:t>
+        <w:t>Ionic</w:t>
+      </w:r>
+      <w:proofErr w:type="spellEnd"/>
+      <w:r>
+        <w:rPr>
+          <w:b/>
+          <w:bCs/>
+        </w:rPr>
+        <w:t xml:space="preserve"> + Angular</w:t>
       </w:r>
       <w:r>
         <w:t xml:space="preserve"> (interfaz web/híbrida).</w:t>
@@ -6928,7 +7341,15 @@
         <w:t>Capacitor</w:t>
       </w:r>
       <w:r>
-        <w:t xml:space="preserve"> para plugins nativos.</w:t>
+        <w:t xml:space="preserve"> para </w:t>
+      </w:r>
+      <w:proofErr w:type="spellStart"/>
+      <w:r>
+        <w:t>plugins</w:t>
+      </w:r>
+      <w:proofErr w:type="spellEnd"/>
+      <w:r>
+        <w:t xml:space="preserve"> nativos.</w:t>
       </w:r>
     </w:p>
     <w:p>
@@ -6942,8 +7363,13 @@
         </w:tabs>
         <w:jc w:val="both"/>
       </w:pPr>
-      <w:r>
-        <w:t>Plugins nativos en Java para control de llamadas y grabación.</w:t>
+      <w:proofErr w:type="spellStart"/>
+      <w:r>
+        <w:t>Plugins</w:t>
+      </w:r>
+      <w:proofErr w:type="spellEnd"/>
+      <w:r>
+        <w:t xml:space="preserve"> nativos en Java para control de llamadas y grabación.</w:t>
       </w:r>
     </w:p>
     <w:p>
@@ -7112,8 +7538,20 @@
           <w:szCs w:val="18"/>
           <w:highlight w:val="black"/>
         </w:rPr>
-        <w:t>/SavedCalls</w:t>
-      </w:r>
+        <w:t>/</w:t>
+      </w:r>
+      <w:proofErr w:type="spellStart"/>
+      <w:r>
+        <w:rPr>
+          <w:rFonts w:ascii="Consolas" w:hAnsi="Consolas"/>
+          <w:color w:val="FFFFFF" w:themeColor="background1"/>
+          <w:sz w:val="18"/>
+          <w:szCs w:val="18"/>
+          <w:highlight w:val="black"/>
+        </w:rPr>
+        <w:t>SavedCalls</w:t>
+      </w:r>
+      <w:proofErr w:type="spellEnd"/>
       <w:r>
         <w:rPr>
           <w:rFonts w:ascii="Consolas" w:hAnsi="Consolas"/>
@@ -7130,7 +7568,15 @@
         <w:jc w:val="both"/>
       </w:pPr>
       <w:r>
-        <w:t>Se prioriza robustez frente a complejidad; la app no debe fallar por errores de grabación o permisos</w:t>
+        <w:t xml:space="preserve">Se prioriza robustez frente a complejidad; la </w:t>
+      </w:r>
+      <w:proofErr w:type="gramStart"/>
+      <w:r>
+        <w:t>app</w:t>
+      </w:r>
+      <w:proofErr w:type="gramEnd"/>
+      <w:r>
+        <w:t xml:space="preserve"> no debe fallar por errores de grabación o permisos</w:t>
       </w:r>
       <w:r>
         <w:t>.</w:t>
@@ -7145,8 +7591,13 @@
         <w:jc w:val="both"/>
       </w:pPr>
       <w:r>
-        <w:t>Sin sincronización cloud</w:t>
-      </w:r>
+        <w:t xml:space="preserve">Sin sincronización </w:t>
+      </w:r>
+      <w:proofErr w:type="spellStart"/>
+      <w:r>
+        <w:t>cloud</w:t>
+      </w:r>
+      <w:proofErr w:type="spellEnd"/>
       <w:r>
         <w:t>.</w:t>
       </w:r>
@@ -7230,7 +7681,23 @@
         <w:jc w:val="both"/>
       </w:pPr>
       <w:r>
-        <w:t>La app depende de la compatibilidad de Android con APIs de grabación y gestión de llamadas; futuras restricciones de fabricantes podrían requerir ajustes.</w:t>
+        <w:t xml:space="preserve">La </w:t>
+      </w:r>
+      <w:proofErr w:type="gramStart"/>
+      <w:r>
+        <w:t>app</w:t>
+      </w:r>
+      <w:proofErr w:type="gramEnd"/>
+      <w:r>
+        <w:t xml:space="preserve"> depende de la compatibilidad de Android con </w:t>
+      </w:r>
+      <w:proofErr w:type="spellStart"/>
+      <w:r>
+        <w:t>APIs</w:t>
+      </w:r>
+      <w:proofErr w:type="spellEnd"/>
+      <w:r>
+        <w:t xml:space="preserve"> de grabación y gestión de llamadas; futuras restricciones de fabricantes podrían requerir ajustes.</w:t>
       </w:r>
     </w:p>
     <w:p>
@@ -7242,7 +7709,15 @@
         <w:jc w:val="both"/>
       </w:pPr>
       <w:r>
-        <w:t>El dispositivo permite acceso a APIs de grabación</w:t>
+        <w:t xml:space="preserve">El dispositivo permite acceso a </w:t>
+      </w:r>
+      <w:proofErr w:type="spellStart"/>
+      <w:r>
+        <w:t>APIs</w:t>
+      </w:r>
+      <w:proofErr w:type="spellEnd"/>
+      <w:r>
+        <w:t xml:space="preserve"> de grabación</w:t>
       </w:r>
       <w:r>
         <w:t>.</w:t>
@@ -7272,7 +7747,15 @@
         <w:jc w:val="both"/>
       </w:pPr>
       <w:r>
-        <w:t>Se asume que la base de Ionic + Angular y Capacitor se mantiene estable y compatible con Android 10+.</w:t>
+        <w:t xml:space="preserve">Se asume que la base de </w:t>
+      </w:r>
+      <w:proofErr w:type="spellStart"/>
+      <w:r>
+        <w:t>Ionic</w:t>
+      </w:r>
+      <w:proofErr w:type="spellEnd"/>
+      <w:r>
+        <w:t xml:space="preserve"> + Angular y Capacitor se mantiene estable y compatible con Android 10+.</w:t>
       </w:r>
     </w:p>
     <w:p>
@@ -7323,16 +7806,10 @@
         <w:pStyle w:val="Ttulo1"/>
       </w:pPr>
       <w:r>
-        <w:rPr>
-          <w:caps w:val="0"/>
-        </w:rPr>
         <w:lastRenderedPageBreak/>
         <w:t>STAKEHOLDERS Y NECESIDADES</w:t>
       </w:r>
       <w:r>
-        <w:rPr>
-          <w:caps w:val="0"/>
-        </w:rPr>
         <w:t xml:space="preserve"> </w:t>
       </w:r>
       <w:hyperlink w:anchor="_ÍNDICE_1" w:history="1">
@@ -7359,12 +7836,14 @@
       <w:r>
         <w:t xml:space="preserve">Identificación de </w:t>
       </w:r>
+      <w:proofErr w:type="spellStart"/>
       <w:r>
         <w:t>S</w:t>
       </w:r>
       <w:r>
         <w:t>takeholders</w:t>
       </w:r>
+      <w:proofErr w:type="spellEnd"/>
     </w:p>
     <w:p/>
     <w:tbl>
@@ -7396,9 +7875,11 @@
             <w:pPr>
               <w:jc w:val="center"/>
             </w:pPr>
+            <w:proofErr w:type="spellStart"/>
             <w:r>
               <w:t>Stakeholder</w:t>
             </w:r>
+            <w:proofErr w:type="spellEnd"/>
           </w:p>
         </w:tc>
         <w:tc>
@@ -7732,12 +8213,21 @@
                 <w:szCs w:val="18"/>
               </w:rPr>
             </w:pPr>
+            <w:proofErr w:type="spellStart"/>
             <w:r>
               <w:rPr>
                 <w:sz w:val="18"/>
                 <w:szCs w:val="18"/>
               </w:rPr>
-              <w:t>Product Owner (PO)</w:t>
+              <w:t>Product</w:t>
+            </w:r>
+            <w:proofErr w:type="spellEnd"/>
+            <w:r>
+              <w:rPr>
+                <w:sz w:val="18"/>
+                <w:szCs w:val="18"/>
+              </w:rPr>
+              <w:t xml:space="preserve"> Owner (PO)</w:t>
             </w:r>
           </w:p>
         </w:tc>
@@ -7982,7 +8472,23 @@
                 <w:sz w:val="18"/>
                 <w:szCs w:val="18"/>
               </w:rPr>
-              <w:t>Scrum Master / SA</w:t>
+              <w:t xml:space="preserve">Scrum </w:t>
+            </w:r>
+            <w:proofErr w:type="gramStart"/>
+            <w:r>
+              <w:rPr>
+                <w:sz w:val="18"/>
+                <w:szCs w:val="18"/>
+              </w:rPr>
+              <w:t>Master</w:t>
+            </w:r>
+            <w:proofErr w:type="gramEnd"/>
+            <w:r>
+              <w:rPr>
+                <w:sz w:val="18"/>
+                <w:szCs w:val="18"/>
+              </w:rPr>
+              <w:t xml:space="preserve"> / SA</w:t>
             </w:r>
           </w:p>
         </w:tc>
@@ -8237,7 +8743,23 @@
                 <w:sz w:val="18"/>
                 <w:szCs w:val="18"/>
               </w:rPr>
-              <w:t>Plataformas / fabricantes (Google, OEMs)</w:t>
+              <w:t xml:space="preserve">Plataformas / fabricantes (Google, </w:t>
+            </w:r>
+            <w:proofErr w:type="spellStart"/>
+            <w:r>
+              <w:rPr>
+                <w:sz w:val="18"/>
+                <w:szCs w:val="18"/>
+              </w:rPr>
+              <w:t>OEMs</w:t>
+            </w:r>
+            <w:proofErr w:type="spellEnd"/>
+            <w:r>
+              <w:rPr>
+                <w:sz w:val="18"/>
+                <w:szCs w:val="18"/>
+              </w:rPr>
+              <w:t>)</w:t>
             </w:r>
           </w:p>
         </w:tc>
@@ -8288,8 +8810,18 @@
                 <w:sz w:val="18"/>
                 <w:szCs w:val="18"/>
               </w:rPr>
-              <w:t>Proveen el sistema operativo y APIs</w:t>
+              <w:t xml:space="preserve">Proveen el sistema operativo y </w:t>
             </w:r>
+            <w:proofErr w:type="spellStart"/>
+            <w:r>
+              <w:rPr>
+                <w:color w:val="FFFFFF" w:themeColor="background1"/>
+                <w:sz w:val="18"/>
+                <w:szCs w:val="18"/>
+              </w:rPr>
+              <w:t>APIs</w:t>
+            </w:r>
+            <w:proofErr w:type="spellEnd"/>
           </w:p>
         </w:tc>
         <w:tc>
@@ -8313,7 +8845,25 @@
                 <w:sz w:val="18"/>
                 <w:szCs w:val="18"/>
               </w:rPr>
-              <w:t>Control del acceso a APIs y restricciones técnicas</w:t>
+              <w:t xml:space="preserve">Control del acceso a </w:t>
+            </w:r>
+            <w:proofErr w:type="spellStart"/>
+            <w:r>
+              <w:rPr>
+                <w:color w:val="FFFFFF" w:themeColor="background1"/>
+                <w:sz w:val="18"/>
+                <w:szCs w:val="18"/>
+              </w:rPr>
+              <w:t>APIs</w:t>
+            </w:r>
+            <w:proofErr w:type="spellEnd"/>
+            <w:r>
+              <w:rPr>
+                <w:color w:val="FFFFFF" w:themeColor="background1"/>
+                <w:sz w:val="18"/>
+                <w:szCs w:val="18"/>
+              </w:rPr>
+              <w:t xml:space="preserve"> y restricciones técnicas</w:t>
             </w:r>
           </w:p>
         </w:tc>
@@ -8381,7 +8931,21 @@
         <w:rPr>
           <w:rStyle w:val="Textodelmarcadordeposicin"/>
         </w:rPr>
-        <w:t xml:space="preserve"> no son stakeholders activos del proyecto, pero sí factores de influencia externa crítica que condicionan el diseño técnico.</w:t>
+        <w:t xml:space="preserve"> no son </w:t>
+      </w:r>
+      <w:proofErr w:type="spellStart"/>
+      <w:r>
+        <w:rPr>
+          <w:rStyle w:val="Textodelmarcadordeposicin"/>
+        </w:rPr>
+        <w:t>stakeholders</w:t>
+      </w:r>
+      <w:proofErr w:type="spellEnd"/>
+      <w:r>
+        <w:rPr>
+          <w:rStyle w:val="Textodelmarcadordeposicin"/>
+        </w:rPr>
+        <w:t xml:space="preserve"> activos del proyecto, pero sí factores de influencia externa crítica que condicionan el diseño técnico.</w:t>
       </w:r>
     </w:p>
     <w:p>
@@ -8812,7 +9376,15 @@
         </w:numPr>
       </w:pPr>
       <w:r>
-        <w:t>Acceso a APIs nativas de Android para:</w:t>
+        <w:t xml:space="preserve">Acceso a </w:t>
+      </w:r>
+      <w:proofErr w:type="spellStart"/>
+      <w:r>
+        <w:t>APIs</w:t>
+      </w:r>
+      <w:proofErr w:type="spellEnd"/>
+      <w:r>
+        <w:t xml:space="preserve"> nativas de Android para:</w:t>
       </w:r>
     </w:p>
     <w:p>
@@ -8864,8 +9436,21 @@
           <w:tab w:val="num" w:pos="1440"/>
         </w:tabs>
       </w:pPr>
-      <w:r>
-        <w:t>Frontend (Ionic + Angular).</w:t>
+      <w:proofErr w:type="spellStart"/>
+      <w:r>
+        <w:t>Frontend</w:t>
+      </w:r>
+      <w:proofErr w:type="spellEnd"/>
+      <w:r>
+        <w:t xml:space="preserve"> (</w:t>
+      </w:r>
+      <w:proofErr w:type="spellStart"/>
+      <w:r>
+        <w:t>Ionic</w:t>
+      </w:r>
+      <w:proofErr w:type="spellEnd"/>
+      <w:r>
+        <w:t xml:space="preserve"> + Angular).</w:t>
       </w:r>
     </w:p>
     <w:p>
@@ -8892,8 +9477,13 @@
           <w:tab w:val="num" w:pos="1440"/>
         </w:tabs>
       </w:pPr>
-      <w:r>
-        <w:t>Plugins nativos en Java</w:t>
+      <w:proofErr w:type="spellStart"/>
+      <w:r>
+        <w:t>Plugins</w:t>
+      </w:r>
+      <w:proofErr w:type="spellEnd"/>
+      <w:r>
+        <w:t xml:space="preserve"> nativos en Java</w:t>
       </w:r>
       <w:r>
         <w:t xml:space="preserve"> con separación por responsabilidades tanto</w:t>
@@ -8961,8 +9551,18 @@
           <w:color w:val="E7E6E6" w:themeColor="background2"/>
           <w:highlight w:val="black"/>
         </w:rPr>
-        <w:t>/SavedCalls</w:t>
-      </w:r>
+        <w:t>/</w:t>
+      </w:r>
+      <w:proofErr w:type="spellStart"/>
+      <w:r>
+        <w:rPr>
+          <w:rFonts w:ascii="Consolas" w:hAnsi="Consolas"/>
+          <w:color w:val="E7E6E6" w:themeColor="background2"/>
+          <w:highlight w:val="black"/>
+        </w:rPr>
+        <w:t>SavedCalls</w:t>
+      </w:r>
+      <w:proofErr w:type="spellEnd"/>
       <w:r>
         <w:t>).</w:t>
       </w:r>
@@ -9005,11 +9605,16 @@
       <w:r>
         <w:t xml:space="preserve">Sistema mínimo de </w:t>
       </w:r>
+      <w:proofErr w:type="spellStart"/>
       <w:r>
         <w:t>L</w:t>
       </w:r>
       <w:r>
-        <w:t xml:space="preserve">ogging </w:t>
+        <w:t>ogging</w:t>
+      </w:r>
+      <w:proofErr w:type="spellEnd"/>
+      <w:r>
+        <w:t xml:space="preserve"> </w:t>
       </w:r>
       <w:r>
         <w:t>para depuración en tiempo de desarrollo.</w:t>
@@ -9054,7 +9659,15 @@
         </w:numPr>
       </w:pPr>
       <w:r>
-        <w:t>Manejo explícito de errores de permisos o APIs.</w:t>
+        <w:t xml:space="preserve">Manejo explícito de errores de permisos o </w:t>
+      </w:r>
+      <w:proofErr w:type="spellStart"/>
+      <w:r>
+        <w:t>APIs</w:t>
+      </w:r>
+      <w:proofErr w:type="spellEnd"/>
+      <w:r>
+        <w:t>.</w:t>
       </w:r>
     </w:p>
     <w:p>
@@ -9104,6 +9717,7 @@
       <w:r>
         <w:t>(</w:t>
       </w:r>
+      <w:proofErr w:type="spellStart"/>
       <w:r>
         <w:rPr>
           <w:i/>
@@ -9111,6 +9725,7 @@
         </w:rPr>
         <w:t>roadmap</w:t>
       </w:r>
+      <w:proofErr w:type="spellEnd"/>
       <w:r>
         <w:t>).</w:t>
       </w:r>
@@ -9208,8 +9823,13 @@
       <w:bookmarkStart w:id="32" w:name="_Conflictos_y_prioridades"/>
       <w:bookmarkEnd w:id="32"/>
       <w:r>
-        <w:t>Conflictos y prioridades entre stakeholders</w:t>
-      </w:r>
+        <w:t xml:space="preserve">Conflictos y prioridades entre </w:t>
+      </w:r>
+      <w:proofErr w:type="spellStart"/>
+      <w:r>
+        <w:t>stakeholders</w:t>
+      </w:r>
+      <w:proofErr w:type="spellEnd"/>
     </w:p>
     <w:p>
       <w:pPr>
@@ -9520,6 +10140,7 @@
       <w:pPr>
         <w:jc w:val="both"/>
       </w:pPr>
+      <w:proofErr w:type="spellStart"/>
       <w:r>
         <w:rPr>
           <w:b/>
@@ -9527,6 +10148,7 @@
         </w:rPr>
         <w:t>Mexus</w:t>
       </w:r>
+      <w:proofErr w:type="spellEnd"/>
       <w:r>
         <w:t xml:space="preserve"> está diseñado </w:t>
       </w:r>
@@ -9535,7 +10157,23 @@
           <w:b/>
           <w:bCs/>
         </w:rPr>
-        <w:t>para un único stakeholder principal: el usuario final</w:t>
+        <w:t xml:space="preserve">para un único </w:t>
+      </w:r>
+      <w:proofErr w:type="spellStart"/>
+      <w:r>
+        <w:rPr>
+          <w:b/>
+          <w:bCs/>
+        </w:rPr>
+        <w:t>stakeholder</w:t>
+      </w:r>
+      <w:proofErr w:type="spellEnd"/>
+      <w:r>
+        <w:rPr>
+          <w:b/>
+          <w:bCs/>
+        </w:rPr>
+        <w:t xml:space="preserve"> principal: el usuario final</w:t>
       </w:r>
       <w:r>
         <w:t xml:space="preserve">, siendo el resto de </w:t>
@@ -9580,45 +10218,7 @@
           <w:i/>
           <w:iCs/>
         </w:rPr>
-        <w:t>M</w:t>
-      </w:r>
-      <w:r>
-        <w:rPr>
-          <w:b/>
-          <w:bCs/>
-          <w:i/>
-          <w:iCs/>
-          <w:caps w:val="0"/>
-        </w:rPr>
-        <w:t>o</w:t>
-      </w:r>
-      <w:r>
-        <w:rPr>
-          <w:b/>
-          <w:bCs/>
-          <w:i/>
-          <w:iCs/>
-        </w:rPr>
-        <w:t>SC</w:t>
-      </w:r>
-      <w:r>
-        <w:rPr>
-          <w:b/>
-          <w:bCs/>
-          <w:i/>
-          <w:iCs/>
-          <w:caps w:val="0"/>
-        </w:rPr>
-        <w:t>o</w:t>
-      </w:r>
-      <w:r>
-        <w:rPr>
-          <w:b/>
-          <w:bCs/>
-          <w:i/>
-          <w:iCs/>
-        </w:rPr>
-        <w:t>W</w:t>
+        <w:t>MoSCoW</w:t>
       </w:r>
       <w:r>
         <w:t>)</w:t>
@@ -9668,6 +10268,7 @@
       <w:r>
         <w:t xml:space="preserve">Para el proyecto </w:t>
       </w:r>
+      <w:proofErr w:type="spellStart"/>
       <w:r>
         <w:rPr>
           <w:b/>
@@ -9675,6 +10276,7 @@
         </w:rPr>
         <w:t>Mexus</w:t>
       </w:r>
+      <w:proofErr w:type="spellEnd"/>
       <w:r>
         <w:t xml:space="preserve">, la priorización de requisitos se realizará utilizando la metodología </w:t>
       </w:r>
@@ -9808,7 +10410,15 @@
         <w:jc w:val="both"/>
       </w:pPr>
       <w:r>
-        <w:t>Dependencia de APIs nativas sujetas a restricciones del sistema operativo o fabricantes.</w:t>
+        <w:t xml:space="preserve">Dependencia de </w:t>
+      </w:r>
+      <w:proofErr w:type="spellStart"/>
+      <w:r>
+        <w:t>APIs</w:t>
+      </w:r>
+      <w:proofErr w:type="spellEnd"/>
+      <w:r>
+        <w:t xml:space="preserve"> nativas sujetas a restricciones del sistema operativo o fabricantes.</w:t>
       </w:r>
     </w:p>
     <w:p>
@@ -10202,6 +10812,7 @@
       <w:pPr>
         <w:jc w:val="both"/>
       </w:pPr>
+      <w:proofErr w:type="gramStart"/>
       <w:r>
         <w:t>Requ</w:t>
       </w:r>
@@ -10218,6 +10829,7 @@
         </w:rPr>
         <w:t>imprescindibles</w:t>
       </w:r>
+      <w:proofErr w:type="gramEnd"/>
       <w:r>
         <w:t xml:space="preserve"> sin los cuales:</w:t>
       </w:r>
@@ -10264,12 +10876,21 @@
       <w:r>
         <w:t xml:space="preserve">Sin estos requisitos, </w:t>
       </w:r>
+      <w:proofErr w:type="spellStart"/>
       <w:r>
         <w:rPr>
           <w:b/>
           <w:bCs/>
         </w:rPr>
-        <w:t>Mexus no tiene sentido como producto</w:t>
+        <w:t>Mexus</w:t>
+      </w:r>
+      <w:proofErr w:type="spellEnd"/>
+      <w:r>
+        <w:rPr>
+          <w:b/>
+          <w:bCs/>
+        </w:rPr>
+        <w:t xml:space="preserve"> no tiene sentido como producto</w:t>
       </w:r>
       <w:r>
         <w:t>.</w:t>
@@ -10284,9 +10905,14 @@
       <w:pPr>
         <w:pStyle w:val="Ttulo3"/>
       </w:pPr>
+      <w:proofErr w:type="spellStart"/>
       <w:r>
         <w:lastRenderedPageBreak/>
-        <w:t>Should Have (S)</w:t>
+        <w:t>Should</w:t>
+      </w:r>
+      <w:proofErr w:type="spellEnd"/>
+      <w:r>
+        <w:t xml:space="preserve"> Have (S)</w:t>
       </w:r>
     </w:p>
     <w:p>
@@ -10378,8 +11004,13 @@
       <w:pPr>
         <w:pStyle w:val="Ttulo3"/>
       </w:pPr>
-      <w:r>
-        <w:t>Could Have (C)</w:t>
+      <w:proofErr w:type="spellStart"/>
+      <w:r>
+        <w:t>Could</w:t>
+      </w:r>
+      <w:proofErr w:type="spellEnd"/>
+      <w:r>
+        <w:t xml:space="preserve"> Have (C)</w:t>
       </w:r>
     </w:p>
     <w:p>
@@ -10461,8 +11092,13 @@
       <w:pPr>
         <w:pStyle w:val="Ttulo3"/>
       </w:pPr>
-      <w:r>
-        <w:t>Won’t Have (W) (para versión</w:t>
+      <w:proofErr w:type="spellStart"/>
+      <w:r>
+        <w:t>Won’t</w:t>
+      </w:r>
+      <w:proofErr w:type="spellEnd"/>
+      <w:r>
+        <w:t xml:space="preserve"> Have (W) (para versión</w:t>
       </w:r>
       <w:r>
         <w:t xml:space="preserve"> inicial 0.1.0</w:t>
@@ -10565,7 +11201,23 @@
       <w:bookmarkStart w:id="37" w:name="_Alcance_del_MVP"/>
       <w:bookmarkEnd w:id="37"/>
       <w:r>
-        <w:t>Alcance del MVP (Minimum Viable Product)</w:t>
+        <w:t>Alcance del MVP (</w:t>
+      </w:r>
+      <w:proofErr w:type="spellStart"/>
+      <w:r>
+        <w:t>Minimum</w:t>
+      </w:r>
+      <w:proofErr w:type="spellEnd"/>
+      <w:r>
+        <w:t xml:space="preserve"> Viable </w:t>
+      </w:r>
+      <w:proofErr w:type="spellStart"/>
+      <w:r>
+        <w:t>Product</w:t>
+      </w:r>
+      <w:proofErr w:type="spellEnd"/>
+      <w:r>
+        <w:t>)</w:t>
       </w:r>
     </w:p>
     <w:p/>
@@ -10581,7 +11233,23 @@
           <w:b/>
           <w:bCs/>
         </w:rPr>
-        <w:t>MVP de Mexus (versión 0.1.0)</w:t>
+        <w:t xml:space="preserve">MVP de </w:t>
+      </w:r>
+      <w:proofErr w:type="spellStart"/>
+      <w:r>
+        <w:rPr>
+          <w:b/>
+          <w:bCs/>
+        </w:rPr>
+        <w:t>Mexus</w:t>
+      </w:r>
+      <w:proofErr w:type="spellEnd"/>
+      <w:r>
+        <w:rPr>
+          <w:b/>
+          <w:bCs/>
+        </w:rPr>
+        <w:t xml:space="preserve"> (versión 0.1.0)</w:t>
       </w:r>
       <w:r>
         <w:t xml:space="preserve"> se define como:</w:t>
@@ -10851,7 +11519,31 @@
       </w:pPr>
       <w:r>
         <w:lastRenderedPageBreak/>
-        <w:t>Excluido del MVP (Should / Could / Won’t)</w:t>
+        <w:t>Excluido del MVP (</w:t>
+      </w:r>
+      <w:proofErr w:type="spellStart"/>
+      <w:r>
+        <w:t>Should</w:t>
+      </w:r>
+      <w:proofErr w:type="spellEnd"/>
+      <w:r>
+        <w:t xml:space="preserve"> / </w:t>
+      </w:r>
+      <w:proofErr w:type="spellStart"/>
+      <w:r>
+        <w:t>Could</w:t>
+      </w:r>
+      <w:proofErr w:type="spellEnd"/>
+      <w:r>
+        <w:t xml:space="preserve"> / </w:t>
+      </w:r>
+      <w:proofErr w:type="spellStart"/>
+      <w:r>
+        <w:t>Won’t</w:t>
+      </w:r>
+      <w:proofErr w:type="spellEnd"/>
+      <w:r>
+        <w:t>)</w:t>
       </w:r>
     </w:p>
     <w:p>
@@ -10945,8 +11637,13 @@
       <w:r>
         <w:t xml:space="preserve">Configuración </w:t>
       </w:r>
-      <w:r>
-        <w:t>avanzda (</w:t>
+      <w:proofErr w:type="spellStart"/>
+      <w:r>
+        <w:t>avanzda</w:t>
+      </w:r>
+      <w:proofErr w:type="spellEnd"/>
+      <w:r>
+        <w:t xml:space="preserve"> (</w:t>
       </w:r>
       <w:r>
         <w:rPr>
@@ -11010,8 +11707,13 @@
         </w:numPr>
         <w:jc w:val="both"/>
       </w:pPr>
-      <w:r>
-        <w:t>Backend, usuarios, autenticación</w:t>
+      <w:proofErr w:type="spellStart"/>
+      <w:r>
+        <w:t>Backend</w:t>
+      </w:r>
+      <w:proofErr w:type="spellEnd"/>
+      <w:r>
+        <w:t>, usuarios, autenticación</w:t>
       </w:r>
       <w:r>
         <w:t xml:space="preserve"> (</w:t>
@@ -11039,8 +11741,13 @@
         <w:jc w:val="both"/>
       </w:pPr>
       <w:r>
-        <w:t>Sincronización cloud</w:t>
-      </w:r>
+        <w:t xml:space="preserve">Sincronización </w:t>
+      </w:r>
+      <w:proofErr w:type="spellStart"/>
+      <w:r>
+        <w:t>cloud</w:t>
+      </w:r>
+      <w:proofErr w:type="spellEnd"/>
       <w:r>
         <w:t xml:space="preserve"> (</w:t>
       </w:r>
@@ -11067,7 +11774,15 @@
         <w:jc w:val="both"/>
       </w:pPr>
       <w:r>
-        <w:t>Publicación en stores oficiales</w:t>
+        <w:t xml:space="preserve">Publicación en </w:t>
+      </w:r>
+      <w:proofErr w:type="spellStart"/>
+      <w:r>
+        <w:t>stores</w:t>
+      </w:r>
+      <w:proofErr w:type="spellEnd"/>
+      <w:r>
+        <w:t xml:space="preserve"> oficiales</w:t>
       </w:r>
       <w:r>
         <w:t xml:space="preserve"> (</w:t>
@@ -11475,7 +12190,15 @@
         <w:jc w:val="both"/>
       </w:pPr>
       <w:r>
-        <w:t>Evitar creep funcional.</w:t>
+        <w:t xml:space="preserve">Evitar </w:t>
+      </w:r>
+      <w:proofErr w:type="spellStart"/>
+      <w:r>
+        <w:t>creep</w:t>
+      </w:r>
+      <w:proofErr w:type="spellEnd"/>
+      <w:r>
+        <w:t xml:space="preserve"> funcional.</w:t>
       </w:r>
     </w:p>
     <w:p>
@@ -11594,13 +12317,47 @@
       <w:r>
         <w:t xml:space="preserve"> = </w:t>
       </w:r>
+      <w:proofErr w:type="spellStart"/>
       <w:r>
         <w:rPr>
           <w:i/>
           <w:iCs/>
         </w:rPr>
-        <w:t>Internal Functional Requirement</w:t>
-      </w:r>
+        <w:t>Internal</w:t>
+      </w:r>
+      <w:proofErr w:type="spellEnd"/>
+      <w:r>
+        <w:rPr>
+          <w:i/>
+          <w:iCs/>
+        </w:rPr>
+        <w:t xml:space="preserve"> </w:t>
+      </w:r>
+      <w:proofErr w:type="spellStart"/>
+      <w:r>
+        <w:rPr>
+          <w:i/>
+          <w:iCs/>
+        </w:rPr>
+        <w:t>Functional</w:t>
+      </w:r>
+      <w:proofErr w:type="spellEnd"/>
+      <w:r>
+        <w:rPr>
+          <w:i/>
+          <w:iCs/>
+        </w:rPr>
+        <w:t xml:space="preserve"> </w:t>
+      </w:r>
+      <w:proofErr w:type="spellStart"/>
+      <w:r>
+        <w:rPr>
+          <w:i/>
+          <w:iCs/>
+        </w:rPr>
+        <w:t>Requirement</w:t>
+      </w:r>
+      <w:proofErr w:type="spellEnd"/>
     </w:p>
     <w:p>
       <w:pPr>
@@ -11797,8 +12554,13 @@
         <w:t>M</w:t>
       </w:r>
       <w:r>
-        <w:t>)ust</w:t>
-      </w:r>
+        <w:t>)</w:t>
+      </w:r>
+      <w:proofErr w:type="spellStart"/>
+      <w:r>
+        <w:t>ust</w:t>
+      </w:r>
+      <w:proofErr w:type="spellEnd"/>
     </w:p>
     <w:p>
       <w:pPr>
@@ -11912,7 +12674,15 @@
         </w:r>
       </w:hyperlink>
       <w:r>
-        <w:t xml:space="preserve"> (plugin Recorder funcional).</w:t>
+        <w:t xml:space="preserve"> (plugin </w:t>
+      </w:r>
+      <w:proofErr w:type="spellStart"/>
+      <w:r>
+        <w:t>Recorder</w:t>
+      </w:r>
+      <w:proofErr w:type="spellEnd"/>
+      <w:r>
+        <w:t xml:space="preserve"> funcional).</w:t>
       </w:r>
     </w:p>
     <w:p>
@@ -11980,7 +12750,15 @@
         </w:r>
       </w:hyperlink>
       <w:r>
-        <w:t xml:space="preserve"> (logging para errores de </w:t>
+        <w:t xml:space="preserve"> (</w:t>
+      </w:r>
+      <w:proofErr w:type="spellStart"/>
+      <w:r>
+        <w:t>logging</w:t>
+      </w:r>
+      <w:proofErr w:type="spellEnd"/>
+      <w:r>
+        <w:t xml:space="preserve"> para errores de </w:t>
       </w:r>
       <w:r>
         <w:t>configuración</w:t>
@@ -12040,6 +12818,7 @@
       <w:r>
         <w:t xml:space="preserve">Durante una llamada activa, la UI de </w:t>
       </w:r>
+      <w:proofErr w:type="spellStart"/>
       <w:r>
         <w:rPr>
           <w:b/>
@@ -12047,6 +12826,7 @@
         </w:rPr>
         <w:t>Mexus</w:t>
       </w:r>
+      <w:proofErr w:type="spellEnd"/>
       <w:r>
         <w:t xml:space="preserve"> debe mostrar un control (botón) que indique el estado actual: “</w:t>
       </w:r>
@@ -12290,8 +13070,13 @@
         <w:t>M</w:t>
       </w:r>
       <w:r>
-        <w:t>)ust</w:t>
-      </w:r>
+        <w:t>)</w:t>
+      </w:r>
+      <w:proofErr w:type="spellStart"/>
+      <w:r>
+        <w:t>ust</w:t>
+      </w:r>
+      <w:proofErr w:type="spellEnd"/>
     </w:p>
     <w:p>
       <w:pPr>
@@ -12391,7 +13176,15 @@
         </w:r>
       </w:hyperlink>
       <w:r>
-        <w:t xml:space="preserve"> (plugin Recorder funcional)</w:t>
+        <w:t xml:space="preserve"> (plugin </w:t>
+      </w:r>
+      <w:proofErr w:type="spellStart"/>
+      <w:r>
+        <w:t>Recorder</w:t>
+      </w:r>
+      <w:proofErr w:type="spellEnd"/>
+      <w:r>
+        <w:t xml:space="preserve"> funcional)</w:t>
       </w:r>
       <w:r>
         <w:t>.</w:t>
@@ -12446,7 +13239,15 @@
         </w:r>
       </w:hyperlink>
       <w:r>
-        <w:t xml:space="preserve"> (logging para errores de </w:t>
+        <w:t xml:space="preserve"> (</w:t>
+      </w:r>
+      <w:proofErr w:type="spellStart"/>
+      <w:r>
+        <w:t>logging</w:t>
+      </w:r>
+      <w:proofErr w:type="spellEnd"/>
+      <w:r>
+        <w:t xml:space="preserve"> para errores de </w:t>
       </w:r>
       <w:r>
         <w:t>configuración</w:t>
@@ -12572,8 +13373,13 @@
         <w:t>M</w:t>
       </w:r>
       <w:r>
-        <w:t>)ust</w:t>
-      </w:r>
+        <w:t>)</w:t>
+      </w:r>
+      <w:proofErr w:type="spellStart"/>
+      <w:r>
+        <w:t>ust</w:t>
+      </w:r>
+      <w:proofErr w:type="spellEnd"/>
     </w:p>
     <w:p>
       <w:pPr>
@@ -12715,7 +13521,15 @@
         </w:r>
       </w:hyperlink>
       <w:r>
-        <w:t xml:space="preserve"> (plugin Recorder funcional)</w:t>
+        <w:t xml:space="preserve"> (plugin </w:t>
+      </w:r>
+      <w:proofErr w:type="spellStart"/>
+      <w:r>
+        <w:t>Recorder</w:t>
+      </w:r>
+      <w:proofErr w:type="spellEnd"/>
+      <w:r>
+        <w:t xml:space="preserve"> funcional)</w:t>
       </w:r>
       <w:r>
         <w:t>.</w:t>
@@ -12770,7 +13584,15 @@
         </w:r>
       </w:hyperlink>
       <w:r>
-        <w:t xml:space="preserve"> (logging para errores de </w:t>
+        <w:t xml:space="preserve"> (</w:t>
+      </w:r>
+      <w:proofErr w:type="spellStart"/>
+      <w:r>
+        <w:t>logging</w:t>
+      </w:r>
+      <w:proofErr w:type="spellEnd"/>
+      <w:r>
+        <w:t xml:space="preserve"> para errores de </w:t>
       </w:r>
       <w:r>
         <w:t>configuración</w:t>
@@ -12882,7 +13704,15 @@
         <w:t>04</w:t>
       </w:r>
       <w:r>
-        <w:t xml:space="preserve"> Plugins separados para estado de llamada y grabación</w:t>
+        <w:t xml:space="preserve"> </w:t>
+      </w:r>
+      <w:proofErr w:type="spellStart"/>
+      <w:r>
+        <w:t>Plugins</w:t>
+      </w:r>
+      <w:proofErr w:type="spellEnd"/>
+      <w:r>
+        <w:t xml:space="preserve"> separados para estado de llamada y grabación</w:t>
       </w:r>
     </w:p>
     <w:p>
@@ -12906,7 +13736,15 @@
       </w:r>
       <w:r>
         <w:br/>
-        <w:t>La integración nativa debe realizarse mediante al menos dos plugins de Capacitor separados:</w:t>
+        <w:t xml:space="preserve">La integración nativa debe realizarse mediante al menos dos </w:t>
+      </w:r>
+      <w:proofErr w:type="spellStart"/>
+      <w:r>
+        <w:t>plugins</w:t>
+      </w:r>
+      <w:proofErr w:type="spellEnd"/>
+      <w:r>
+        <w:t xml:space="preserve"> de Capacitor separados:</w:t>
       </w:r>
     </w:p>
     <w:p>
@@ -12918,6 +13756,7 @@
         </w:numPr>
         <w:jc w:val="both"/>
       </w:pPr>
+      <w:proofErr w:type="spellStart"/>
       <w:r>
         <w:rPr>
           <w:i/>
@@ -12925,6 +13764,7 @@
         </w:rPr>
         <w:t>CallState</w:t>
       </w:r>
+      <w:proofErr w:type="spellEnd"/>
       <w:r>
         <w:t>: detección y notificación de estado de llamadas.</w:t>
       </w:r>
@@ -12938,6 +13778,7 @@
         </w:numPr>
         <w:jc w:val="both"/>
       </w:pPr>
+      <w:proofErr w:type="spellStart"/>
       <w:r>
         <w:rPr>
           <w:i/>
@@ -12945,6 +13786,7 @@
         </w:rPr>
         <w:t>Recorder</w:t>
       </w:r>
+      <w:proofErr w:type="spellEnd"/>
       <w:r>
         <w:t>: inicio/parada de grabación y gestión de ficheros de audio.</w:t>
       </w:r>
@@ -13037,7 +13879,23 @@
         </w:r>
       </w:hyperlink>
       <w:r>
-        <w:t xml:space="preserve"> (logging básico para depurar plugins).</w:t>
+        <w:t xml:space="preserve"> (</w:t>
+      </w:r>
+      <w:proofErr w:type="spellStart"/>
+      <w:r>
+        <w:t>logging</w:t>
+      </w:r>
+      <w:proofErr w:type="spellEnd"/>
+      <w:r>
+        <w:t xml:space="preserve"> básico para depurar </w:t>
+      </w:r>
+      <w:proofErr w:type="spellStart"/>
+      <w:r>
+        <w:t>plugins</w:t>
+      </w:r>
+      <w:proofErr w:type="spellEnd"/>
+      <w:r>
+        <w:t>).</w:t>
       </w:r>
     </w:p>
     <w:p>
@@ -13071,7 +13929,15 @@
         <w:jc w:val="both"/>
       </w:pPr>
       <w:r>
-        <w:t>Debe existir un plugin nativo para CallState que:</w:t>
+        <w:t>Debe existir un plugin nativo para </w:t>
+      </w:r>
+      <w:proofErr w:type="spellStart"/>
+      <w:r>
+        <w:t>CallState</w:t>
+      </w:r>
+      <w:proofErr w:type="spellEnd"/>
+      <w:r>
+        <w:t> que:</w:t>
       </w:r>
     </w:p>
     <w:p>
@@ -13110,7 +13976,15 @@
         <w:jc w:val="both"/>
       </w:pPr>
       <w:r>
-        <w:t>Debe existir un plugin nativo para Recorder que:</w:t>
+        <w:t>Debe existir un plugin nativo para </w:t>
+      </w:r>
+      <w:proofErr w:type="spellStart"/>
+      <w:r>
+        <w:t>Recorder</w:t>
+      </w:r>
+      <w:proofErr w:type="spellEnd"/>
+      <w:r>
+        <w:t> que:</w:t>
       </w:r>
     </w:p>
     <w:p>
@@ -13149,7 +14023,23 @@
         <w:jc w:val="both"/>
       </w:pPr>
       <w:r>
-        <w:t>La capa Angular no debe acceder directamente a APIs nativas de llamadas o grabación, sino únicamente a través de estos plugins.</w:t>
+        <w:t xml:space="preserve">La capa Angular no debe acceder directamente a </w:t>
+      </w:r>
+      <w:proofErr w:type="spellStart"/>
+      <w:r>
+        <w:t>APIs</w:t>
+      </w:r>
+      <w:proofErr w:type="spellEnd"/>
+      <w:r>
+        <w:t xml:space="preserve"> nativas de llamadas o grabación, sino únicamente a través de estos </w:t>
+      </w:r>
+      <w:proofErr w:type="spellStart"/>
+      <w:r>
+        <w:t>plugins</w:t>
+      </w:r>
+      <w:proofErr w:type="spellEnd"/>
+      <w:r>
+        <w:t>.</w:t>
       </w:r>
     </w:p>
     <w:p>
@@ -13221,8 +14111,13 @@
         <w:t>M</w:t>
       </w:r>
       <w:r>
-        <w:t>)ust</w:t>
-      </w:r>
+        <w:t>)</w:t>
+      </w:r>
+      <w:proofErr w:type="spellStart"/>
+      <w:r>
+        <w:t>ust</w:t>
+      </w:r>
+      <w:proofErr w:type="spellEnd"/>
     </w:p>
     <w:p>
       <w:pPr>
@@ -13310,7 +14205,15 @@
         </w:r>
       </w:hyperlink>
       <w:r>
-        <w:t xml:space="preserve"> (plugin Recorder funcional)</w:t>
+        <w:t xml:space="preserve"> (plugin </w:t>
+      </w:r>
+      <w:proofErr w:type="spellStart"/>
+      <w:r>
+        <w:t>Recorder</w:t>
+      </w:r>
+      <w:proofErr w:type="spellEnd"/>
+      <w:r>
+        <w:t xml:space="preserve"> funcional)</w:t>
       </w:r>
       <w:r>
         <w:t>.</w:t>
@@ -13365,7 +14268,15 @@
         </w:r>
       </w:hyperlink>
       <w:r>
-        <w:t xml:space="preserve"> (logging para errores de </w:t>
+        <w:t xml:space="preserve"> (</w:t>
+      </w:r>
+      <w:proofErr w:type="spellStart"/>
+      <w:r>
+        <w:t>logging</w:t>
+      </w:r>
+      <w:proofErr w:type="spellEnd"/>
+      <w:r>
+        <w:t xml:space="preserve"> para errores de </w:t>
       </w:r>
       <w:r>
         <w:t>configuración</w:t>
@@ -13524,8 +14435,13 @@
         <w:t>M</w:t>
       </w:r>
       <w:r>
-        <w:t>)ust</w:t>
-      </w:r>
+        <w:t>)</w:t>
+      </w:r>
+      <w:proofErr w:type="spellStart"/>
+      <w:r>
+        <w:t>ust</w:t>
+      </w:r>
+      <w:proofErr w:type="spellEnd"/>
     </w:p>
     <w:p>
       <w:pPr>
@@ -13624,7 +14540,21 @@
         <w:rPr>
           <w:rFonts w:eastAsiaTheme="minorHAnsi"/>
         </w:rPr>
-        <w:t>(plugin CallState para obtener tipo y número)</w:t>
+        <w:t xml:space="preserve">(plugin </w:t>
+      </w:r>
+      <w:proofErr w:type="spellStart"/>
+      <w:r>
+        <w:rPr>
+          <w:rFonts w:eastAsiaTheme="minorHAnsi"/>
+        </w:rPr>
+        <w:t>CallState</w:t>
+      </w:r>
+      <w:proofErr w:type="spellEnd"/>
+      <w:r>
+        <w:rPr>
+          <w:rFonts w:eastAsiaTheme="minorHAnsi"/>
+        </w:rPr>
+        <w:t xml:space="preserve"> para obtener tipo y número)</w:t>
       </w:r>
       <w:r>
         <w:rPr>
@@ -13687,7 +14617,15 @@
         </w:r>
       </w:hyperlink>
       <w:r>
-        <w:t xml:space="preserve"> (logging para errores de </w:t>
+        <w:t xml:space="preserve"> (</w:t>
+      </w:r>
+      <w:proofErr w:type="spellStart"/>
+      <w:r>
+        <w:t>logging</w:t>
+      </w:r>
+      <w:proofErr w:type="spellEnd"/>
+      <w:r>
+        <w:t xml:space="preserve"> para errores de </w:t>
       </w:r>
       <w:r>
         <w:t>configuración</w:t>
@@ -13816,8 +14754,13 @@
         <w:t>M</w:t>
       </w:r>
       <w:r>
-        <w:t>)ust</w:t>
-      </w:r>
+        <w:t>)</w:t>
+      </w:r>
+      <w:proofErr w:type="spellStart"/>
+      <w:r>
+        <w:t>ust</w:t>
+      </w:r>
+      <w:proofErr w:type="spellEnd"/>
     </w:p>
     <w:p>
       <w:pPr>
@@ -13971,7 +14914,21 @@
         <w:rPr>
           <w:rFonts w:eastAsiaTheme="minorHAnsi"/>
         </w:rPr>
-        <w:t xml:space="preserve">(plugin CallState </w:t>
+        <w:t xml:space="preserve">(plugin </w:t>
+      </w:r>
+      <w:proofErr w:type="spellStart"/>
+      <w:r>
+        <w:rPr>
+          <w:rFonts w:eastAsiaTheme="minorHAnsi"/>
+        </w:rPr>
+        <w:t>CallState</w:t>
+      </w:r>
+      <w:proofErr w:type="spellEnd"/>
+      <w:r>
+        <w:rPr>
+          <w:rFonts w:eastAsiaTheme="minorHAnsi"/>
+        </w:rPr>
+        <w:t xml:space="preserve"> </w:t>
       </w:r>
       <w:r>
         <w:rPr>
@@ -14052,7 +15009,15 @@
         </w:r>
       </w:hyperlink>
       <w:r>
-        <w:t xml:space="preserve"> (logging para errores de </w:t>
+        <w:t xml:space="preserve"> (</w:t>
+      </w:r>
+      <w:proofErr w:type="spellStart"/>
+      <w:r>
+        <w:t>logging</w:t>
+      </w:r>
+      <w:proofErr w:type="spellEnd"/>
+      <w:r>
+        <w:t xml:space="preserve"> para errores de </w:t>
       </w:r>
       <w:r>
         <w:t>configuración</w:t>
@@ -14099,7 +15064,15 @@
         <w:t xml:space="preserve"> </w:t>
       </w:r>
       <w:r>
-        <w:t>duración (en segundos o formato hh:mm:ss),</w:t>
+        <w:t xml:space="preserve">duración (en segundos o formato </w:t>
+      </w:r>
+      <w:proofErr w:type="spellStart"/>
+      <w:r>
+        <w:t>hh:mm:ss</w:t>
+      </w:r>
+      <w:proofErr w:type="spellEnd"/>
+      <w:r>
+        <w:t>),</w:t>
       </w:r>
       <w:r>
         <w:t xml:space="preserve"> </w:t>
@@ -14222,8 +15195,13 @@
         <w:t>M</w:t>
       </w:r>
       <w:r>
-        <w:t>)ust</w:t>
-      </w:r>
+        <w:t>)</w:t>
+      </w:r>
+      <w:proofErr w:type="spellStart"/>
+      <w:r>
+        <w:t>ust</w:t>
+      </w:r>
+      <w:proofErr w:type="spellEnd"/>
     </w:p>
     <w:p>
       <w:pPr>
@@ -14400,7 +15378,15 @@
         </w:r>
       </w:hyperlink>
       <w:r>
-        <w:t xml:space="preserve"> (logging para errores de </w:t>
+        <w:t xml:space="preserve"> (</w:t>
+      </w:r>
+      <w:proofErr w:type="spellStart"/>
+      <w:r>
+        <w:t>logging</w:t>
+      </w:r>
+      <w:proofErr w:type="spellEnd"/>
+      <w:r>
+        <w:t xml:space="preserve"> para errores de </w:t>
       </w:r>
       <w:r>
         <w:t>configuración</w:t>
@@ -14562,8 +15548,13 @@
         <w:t>M</w:t>
       </w:r>
       <w:r>
-        <w:t>)ust</w:t>
-      </w:r>
+        <w:t>)</w:t>
+      </w:r>
+      <w:proofErr w:type="spellStart"/>
+      <w:r>
+        <w:t>ust</w:t>
+      </w:r>
+      <w:proofErr w:type="spellEnd"/>
     </w:p>
     <w:p>
       <w:pPr>
@@ -14743,7 +15734,15 @@
         </w:r>
       </w:hyperlink>
       <w:r>
-        <w:t xml:space="preserve"> (logging para errores de </w:t>
+        <w:t xml:space="preserve"> (</w:t>
+      </w:r>
+      <w:proofErr w:type="spellStart"/>
+      <w:r>
+        <w:t>logging</w:t>
+      </w:r>
+      <w:proofErr w:type="spellEnd"/>
+      <w:r>
+        <w:t xml:space="preserve"> para errores de </w:t>
       </w:r>
       <w:r>
         <w:t>configuración</w:t>
@@ -14907,8 +15906,13 @@
         <w:t>M</w:t>
       </w:r>
       <w:r>
-        <w:t>)ust</w:t>
-      </w:r>
+        <w:t>)</w:t>
+      </w:r>
+      <w:proofErr w:type="spellStart"/>
+      <w:r>
+        <w:t>ust</w:t>
+      </w:r>
+      <w:proofErr w:type="spellEnd"/>
     </w:p>
     <w:p>
       <w:pPr>
@@ -15086,7 +16090,15 @@
         </w:r>
       </w:hyperlink>
       <w:r>
-        <w:t xml:space="preserve"> (logging para errores de </w:t>
+        <w:t xml:space="preserve"> (</w:t>
+      </w:r>
+      <w:proofErr w:type="spellStart"/>
+      <w:r>
+        <w:t>logging</w:t>
+      </w:r>
+      <w:proofErr w:type="spellEnd"/>
+      <w:r>
+        <w:t xml:space="preserve"> para errores de </w:t>
       </w:r>
       <w:r>
         <w:t>configuración</w:t>
@@ -15266,8 +16278,13 @@
         <w:t>M</w:t>
       </w:r>
       <w:r>
-        <w:t>)ust</w:t>
-      </w:r>
+        <w:t>)</w:t>
+      </w:r>
+      <w:proofErr w:type="spellStart"/>
+      <w:r>
+        <w:t>ust</w:t>
+      </w:r>
+      <w:proofErr w:type="spellEnd"/>
     </w:p>
     <w:p>
       <w:pPr>
@@ -15422,7 +16439,15 @@
         </w:r>
       </w:hyperlink>
       <w:r>
-        <w:t xml:space="preserve"> (logging para errores de </w:t>
+        <w:t xml:space="preserve"> (</w:t>
+      </w:r>
+      <w:proofErr w:type="spellStart"/>
+      <w:r>
+        <w:t>logging</w:t>
+      </w:r>
+      <w:proofErr w:type="spellEnd"/>
+      <w:r>
+        <w:t xml:space="preserve"> para errores de </w:t>
       </w:r>
       <w:r>
         <w:t>configuración</w:t>
@@ -15554,8 +16579,13 @@
         <w:t>M</w:t>
       </w:r>
       <w:r>
-        <w:t>)ust</w:t>
-      </w:r>
+        <w:t>)</w:t>
+      </w:r>
+      <w:proofErr w:type="spellStart"/>
+      <w:r>
+        <w:t>ust</w:t>
+      </w:r>
+      <w:proofErr w:type="spellEnd"/>
     </w:p>
     <w:p>
       <w:pPr>
@@ -15747,7 +16777,15 @@
         <w:t>3</w:t>
       </w:r>
       <w:r>
-        <w:t xml:space="preserve"> Logging mínimo</w:t>
+        <w:t xml:space="preserve"> </w:t>
+      </w:r>
+      <w:proofErr w:type="spellStart"/>
+      <w:r>
+        <w:t>Logging</w:t>
+      </w:r>
+      <w:proofErr w:type="spellEnd"/>
+      <w:r>
+        <w:t xml:space="preserve"> mínimo</w:t>
       </w:r>
     </w:p>
     <w:p>
@@ -15784,8 +16822,13 @@
         <w:t>M</w:t>
       </w:r>
       <w:r>
-        <w:t>)ust</w:t>
-      </w:r>
+        <w:t>)</w:t>
+      </w:r>
+      <w:proofErr w:type="spellStart"/>
+      <w:r>
+        <w:t>ust</w:t>
+      </w:r>
+      <w:proofErr w:type="spellEnd"/>
     </w:p>
     <w:p>
       <w:pPr>
@@ -15804,7 +16847,15 @@
       </w:r>
       <w:r>
         <w:br/>
-        <w:t>El sistema debe contar con un mecanismo de logging mínimo, tanto en la parte nativa como en la parte Angular, para registrar eventos y errores relevantes.</w:t>
+        <w:t xml:space="preserve">El sistema debe contar con un mecanismo de </w:t>
+      </w:r>
+      <w:proofErr w:type="spellStart"/>
+      <w:r>
+        <w:t>logging</w:t>
+      </w:r>
+      <w:proofErr w:type="spellEnd"/>
+      <w:r>
+        <w:t xml:space="preserve"> mínimo, tanto en la parte nativa como en la parte Angular, para registrar eventos y errores relevantes.</w:t>
       </w:r>
     </w:p>
     <w:p>
@@ -15928,7 +16979,15 @@
         <w:jc w:val="both"/>
       </w:pPr>
       <w:r>
-        <w:t>fallos en llamadas a plugins,</w:t>
+        <w:t xml:space="preserve">fallos en llamadas a </w:t>
+      </w:r>
+      <w:proofErr w:type="spellStart"/>
+      <w:r>
+        <w:t>plugins</w:t>
+      </w:r>
+      <w:proofErr w:type="spellEnd"/>
+      <w:r>
+        <w:t>,</w:t>
       </w:r>
     </w:p>
     <w:p>
@@ -15955,7 +17014,15 @@
         <w:jc w:val="both"/>
       </w:pPr>
       <w:r>
-        <w:t>El mecanismo de logging no debe impactar de forma apreciable en el rendimiento ni provocar fallos adicionales.</w:t>
+        <w:t xml:space="preserve">El mecanismo de </w:t>
+      </w:r>
+      <w:proofErr w:type="spellStart"/>
+      <w:r>
+        <w:t>logging</w:t>
+      </w:r>
+      <w:proofErr w:type="spellEnd"/>
+      <w:r>
+        <w:t xml:space="preserve"> no debe impactar de forma apreciable en el rendimiento ni provocar fallos adicionales.</w:t>
       </w:r>
     </w:p>
     <w:p>
@@ -15966,7 +17033,6 @@
     <w:p>
       <w:pPr>
         <w:pStyle w:val="Ttulo1"/>
-        <w:jc w:val="both"/>
       </w:pPr>
       <w:bookmarkStart w:id="57" w:name="_REQUISITOS_NO_FUNCIONALES"/>
       <w:bookmarkEnd w:id="57"/>
@@ -16056,12 +17122,21 @@
       <w:r>
         <w:t xml:space="preserve"> = </w:t>
       </w:r>
+      <w:proofErr w:type="spellStart"/>
       <w:r>
         <w:rPr>
           <w:i/>
           <w:iCs/>
         </w:rPr>
-        <w:t xml:space="preserve">Internal </w:t>
+        <w:t>Internal</w:t>
+      </w:r>
+      <w:proofErr w:type="spellEnd"/>
+      <w:r>
+        <w:rPr>
+          <w:i/>
+          <w:iCs/>
+        </w:rPr>
+        <w:t xml:space="preserve"> </w:t>
       </w:r>
       <w:r>
         <w:rPr>
@@ -16070,13 +17145,31 @@
         </w:rPr>
         <w:t>Non-</w:t>
       </w:r>
+      <w:proofErr w:type="spellStart"/>
       <w:r>
         <w:rPr>
           <w:i/>
           <w:iCs/>
         </w:rPr>
-        <w:t>Functional Requirement</w:t>
-      </w:r>
+        <w:t>Functional</w:t>
+      </w:r>
+      <w:proofErr w:type="spellEnd"/>
+      <w:r>
+        <w:rPr>
+          <w:i/>
+          <w:iCs/>
+        </w:rPr>
+        <w:t xml:space="preserve"> </w:t>
+      </w:r>
+      <w:proofErr w:type="spellStart"/>
+      <w:r>
+        <w:rPr>
+          <w:i/>
+          <w:iCs/>
+        </w:rPr>
+        <w:t>Requirement</w:t>
+      </w:r>
+      <w:proofErr w:type="spellEnd"/>
     </w:p>
     <w:p>
       <w:pPr>
@@ -16169,9 +17262,11 @@
         </w:rPr>
         <w:t>)</w:t>
       </w:r>
+      <w:proofErr w:type="spellStart"/>
       <w:r>
         <w:t>ust</w:t>
       </w:r>
+      <w:proofErr w:type="spellEnd"/>
     </w:p>
     <w:p>
       <w:pPr>
@@ -16277,9 +17372,11 @@
         </w:rPr>
         <w:t>)</w:t>
       </w:r>
+      <w:proofErr w:type="spellStart"/>
       <w:r>
         <w:t>ust</w:t>
       </w:r>
+      <w:proofErr w:type="spellEnd"/>
     </w:p>
     <w:p>
       <w:pPr>
@@ -16390,8 +17487,13 @@
         <w:t>M</w:t>
       </w:r>
       <w:r>
-        <w:t>)ust</w:t>
-      </w:r>
+        <w:t>)</w:t>
+      </w:r>
+      <w:proofErr w:type="spellStart"/>
+      <w:r>
+        <w:t>ust</w:t>
+      </w:r>
+      <w:proofErr w:type="spellEnd"/>
     </w:p>
     <w:p>
       <w:pPr>
@@ -16559,7 +17661,15 @@
         </w:r>
       </w:hyperlink>
       <w:r>
-        <w:t xml:space="preserve"> (logging para errores de </w:t>
+        <w:t xml:space="preserve"> (</w:t>
+      </w:r>
+      <w:proofErr w:type="spellStart"/>
+      <w:r>
+        <w:t>logging</w:t>
+      </w:r>
+      <w:proofErr w:type="spellEnd"/>
+      <w:r>
+        <w:t xml:space="preserve"> para errores de </w:t>
       </w:r>
       <w:r>
         <w:t>configuración</w:t>
@@ -16740,9 +17850,11 @@
         </w:rPr>
         <w:t>)</w:t>
       </w:r>
+      <w:proofErr w:type="spellStart"/>
       <w:r>
         <w:t>ust</w:t>
       </w:r>
+      <w:proofErr w:type="spellEnd"/>
     </w:p>
     <w:p>
       <w:pPr>
@@ -16837,9 +17949,11 @@
         </w:rPr>
         <w:t>)</w:t>
       </w:r>
+      <w:proofErr w:type="spellStart"/>
       <w:r>
         <w:t>ust</w:t>
       </w:r>
+      <w:proofErr w:type="spellEnd"/>
     </w:p>
     <w:p>
       <w:pPr>
@@ -16970,9 +18084,11 @@
         </w:rPr>
         <w:t>)</w:t>
       </w:r>
+      <w:proofErr w:type="spellStart"/>
       <w:r>
         <w:t>hould</w:t>
       </w:r>
+      <w:proofErr w:type="spellEnd"/>
     </w:p>
     <w:p>
       <w:pPr>
@@ -17076,9 +18192,11 @@
         </w:rPr>
         <w:t>)</w:t>
       </w:r>
+      <w:proofErr w:type="spellStart"/>
       <w:r>
         <w:t>ust</w:t>
       </w:r>
+      <w:proofErr w:type="spellEnd"/>
     </w:p>
     <w:p>
       <w:pPr>
@@ -17169,9 +18287,11 @@
         </w:rPr>
         <w:t>)</w:t>
       </w:r>
+      <w:proofErr w:type="spellStart"/>
       <w:r>
         <w:t>ust</w:t>
       </w:r>
+      <w:proofErr w:type="spellEnd"/>
     </w:p>
     <w:p>
       <w:pPr>
@@ -17280,9 +18400,11 @@
         </w:rPr>
         <w:t>)</w:t>
       </w:r>
+      <w:proofErr w:type="spellStart"/>
       <w:r>
         <w:t>ust</w:t>
       </w:r>
+      <w:proofErr w:type="spellEnd"/>
     </w:p>
     <w:p>
       <w:pPr>
@@ -17366,9 +18488,11 @@
         </w:rPr>
         <w:t>)</w:t>
       </w:r>
+      <w:proofErr w:type="spellStart"/>
       <w:r>
         <w:t>hould</w:t>
       </w:r>
+      <w:proofErr w:type="spellEnd"/>
     </w:p>
     <w:p>
       <w:pPr>
@@ -17494,9 +18618,11 @@
         </w:rPr>
         <w:t>)</w:t>
       </w:r>
+      <w:proofErr w:type="spellStart"/>
       <w:r>
         <w:t>ust</w:t>
       </w:r>
+      <w:proofErr w:type="spellEnd"/>
     </w:p>
     <w:p>
       <w:pPr>
@@ -17608,9 +18734,11 @@
         </w:rPr>
         <w:t>)</w:t>
       </w:r>
+      <w:proofErr w:type="spellStart"/>
       <w:r>
         <w:t>ust</w:t>
       </w:r>
+      <w:proofErr w:type="spellEnd"/>
     </w:p>
     <w:p>
       <w:pPr>
@@ -17732,9 +18860,11 @@
         </w:rPr>
         <w:t>)</w:t>
       </w:r>
+      <w:proofErr w:type="spellStart"/>
       <w:r>
         <w:t>ust</w:t>
       </w:r>
+      <w:proofErr w:type="spellEnd"/>
     </w:p>
     <w:p>
       <w:pPr>
@@ -17798,12 +18928,14 @@
       <w:r>
         <w:t xml:space="preserve"> </w:t>
       </w:r>
+      <w:proofErr w:type="spellStart"/>
       <w:r>
         <w:t>Stakeholder</w:t>
       </w:r>
       <w:r>
         <w:t>s</w:t>
       </w:r>
+      <w:proofErr w:type="spellEnd"/>
       <w:r>
         <w:t xml:space="preserve"> </w:t>
       </w:r>
@@ -17851,9 +18983,11 @@
         </w:rPr>
         <w:t>)</w:t>
       </w:r>
+      <w:proofErr w:type="spellStart"/>
       <w:r>
         <w:t>ust</w:t>
       </w:r>
+      <w:proofErr w:type="spellEnd"/>
     </w:p>
     <w:p>
       <w:pPr>
@@ -17959,9 +19093,11 @@
         </w:rPr>
         <w:t>)</w:t>
       </w:r>
+      <w:proofErr w:type="spellStart"/>
       <w:r>
         <w:t>ust</w:t>
       </w:r>
+      <w:proofErr w:type="spellEnd"/>
     </w:p>
     <w:p>
       <w:pPr>
@@ -18135,9 +19271,11 @@
         </w:rPr>
         <w:t>)</w:t>
       </w:r>
+      <w:proofErr w:type="spellStart"/>
       <w:r>
         <w:t>ust</w:t>
       </w:r>
+      <w:proofErr w:type="spellEnd"/>
     </w:p>
     <w:p>
       <w:pPr>
@@ -18239,9 +19377,11 @@
         </w:rPr>
         <w:t>)</w:t>
       </w:r>
+      <w:proofErr w:type="spellStart"/>
       <w:r>
         <w:t>ust</w:t>
       </w:r>
+      <w:proofErr w:type="spellEnd"/>
     </w:p>
     <w:p>
       <w:pPr>
@@ -18314,7 +19454,15 @@
         <w:t>8</w:t>
       </w:r>
       <w:r>
-        <w:t xml:space="preserve"> Setup de proyecto Angular + Capacitor</w:t>
+        <w:t xml:space="preserve"> </w:t>
+      </w:r>
+      <w:proofErr w:type="spellStart"/>
+      <w:r>
+        <w:t>Setup</w:t>
+      </w:r>
+      <w:proofErr w:type="spellEnd"/>
+      <w:r>
+        <w:t xml:space="preserve"> de proyecto Angular + Capacitor</w:t>
       </w:r>
     </w:p>
     <w:p>
@@ -18357,9 +19505,11 @@
         </w:rPr>
         <w:t>)</w:t>
       </w:r>
+      <w:proofErr w:type="spellStart"/>
       <w:r>
         <w:t>ust</w:t>
       </w:r>
+      <w:proofErr w:type="spellEnd"/>
     </w:p>
     <w:p>
       <w:pPr>
@@ -18392,6 +19542,7 @@
       <w:r>
         <w:t xml:space="preserve">l proyecto </w:t>
       </w:r>
+      <w:proofErr w:type="spellStart"/>
       <w:r>
         <w:rPr>
           <w:b/>
@@ -18399,6 +19550,7 @@
         </w:rPr>
         <w:t>Mexus</w:t>
       </w:r>
+      <w:proofErr w:type="spellEnd"/>
       <w:r>
         <w:t xml:space="preserve"> debe estar creado desde cero con Angular e integrar Capacitor para </w:t>
       </w:r>
@@ -18487,9 +19639,11 @@
         </w:rPr>
         <w:t>)</w:t>
       </w:r>
+      <w:proofErr w:type="spellStart"/>
       <w:r>
         <w:t>ust</w:t>
       </w:r>
+      <w:proofErr w:type="spellEnd"/>
     </w:p>
     <w:p>
       <w:pPr>
@@ -18523,7 +19677,15 @@
         <w:t xml:space="preserve"> I</w:t>
       </w:r>
       <w:r>
-        <w:t>mplementado al menos una pantalla de prueba y pequeñas funcionalidades que confirmen la correcta comprensión del stack actual.</w:t>
+        <w:t xml:space="preserve">mplementado al menos una pantalla de prueba y pequeñas funcionalidades que confirmen la correcta comprensión del </w:t>
+      </w:r>
+      <w:proofErr w:type="spellStart"/>
+      <w:r>
+        <w:t>stack</w:t>
+      </w:r>
+      <w:proofErr w:type="spellEnd"/>
+      <w:r>
+        <w:t xml:space="preserve"> actual.</w:t>
       </w:r>
     </w:p>
     <w:p>
@@ -18534,7 +19696,6 @@
     <w:p>
       <w:pPr>
         <w:pStyle w:val="Ttulo1"/>
-        <w:jc w:val="both"/>
       </w:pPr>
       <w:bookmarkStart w:id="72" w:name="_RESTRICCIONES_TÉCNICAS_-"/>
       <w:bookmarkEnd w:id="72"/>
@@ -18658,7 +19819,15 @@
       <w:bookmarkStart w:id="74" w:name="_Arquitectura_y_stack"/>
       <w:bookmarkEnd w:id="74"/>
       <w:r>
-        <w:t>Arquitectura y stack tecnológico</w:t>
+        <w:t xml:space="preserve">Arquitectura y </w:t>
+      </w:r>
+      <w:proofErr w:type="spellStart"/>
+      <w:r>
+        <w:t>stack</w:t>
+      </w:r>
+      <w:proofErr w:type="spellEnd"/>
+      <w:r>
+        <w:t xml:space="preserve"> tecnológico</w:t>
       </w:r>
     </w:p>
     <w:p>
@@ -18703,36 +19872,54 @@
       <w:r>
         <w:t>(</w:t>
       </w:r>
+      <w:proofErr w:type="spellStart"/>
       <w:r>
         <w:rPr>
           <w:b/>
           <w:bCs/>
         </w:rPr>
-        <w:t>Ionic + Angular</w:t>
-      </w:r>
-      <w:r>
-        <w:t>), y</w:t>
-      </w:r>
-    </w:p>
-    <w:p>
-      <w:pPr>
-        <w:numPr>
-          <w:ilvl w:val="1"/>
-          <w:numId w:val="199"/>
-        </w:numPr>
-        <w:ind w:left="714" w:hanging="357"/>
-        <w:jc w:val="both"/>
-      </w:pPr>
-      <w:r>
-        <w:t>el código nativo Android (</w:t>
-      </w:r>
+        <w:t>Ionic</w:t>
+      </w:r>
+      <w:proofErr w:type="spellEnd"/>
       <w:r>
         <w:rPr>
           <w:b/>
           <w:bCs/>
         </w:rPr>
-        <w:t>Java/Kotlin</w:t>
-      </w:r>
+        <w:t xml:space="preserve"> + Angular</w:t>
+      </w:r>
+      <w:r>
+        <w:t>), y</w:t>
+      </w:r>
+    </w:p>
+    <w:p>
+      <w:pPr>
+        <w:numPr>
+          <w:ilvl w:val="1"/>
+          <w:numId w:val="199"/>
+        </w:numPr>
+        <w:ind w:left="714" w:hanging="357"/>
+        <w:jc w:val="both"/>
+      </w:pPr>
+      <w:r>
+        <w:t>el código nativo Android (</w:t>
+      </w:r>
+      <w:r>
+        <w:rPr>
+          <w:b/>
+          <w:bCs/>
+        </w:rPr>
+        <w:t>Java/</w:t>
+      </w:r>
+      <w:proofErr w:type="spellStart"/>
+      <w:r>
+        <w:rPr>
+          <w:b/>
+          <w:bCs/>
+        </w:rPr>
+        <w:t>Kotlin</w:t>
+      </w:r>
+      <w:proofErr w:type="spellEnd"/>
       <w:r>
         <w:t>) para l</w:t>
       </w:r>
@@ -18791,8 +19978,13 @@
         </w:numPr>
         <w:jc w:val="both"/>
       </w:pPr>
-      <w:r>
-        <w:t>Cordova,</w:t>
+      <w:proofErr w:type="spellStart"/>
+      <w:r>
+        <w:t>Cordova</w:t>
+      </w:r>
+      <w:proofErr w:type="spellEnd"/>
+      <w:r>
+        <w:t>,</w:t>
       </w:r>
     </w:p>
     <w:p>
@@ -18924,7 +20116,23 @@
           <w:b/>
           <w:bCs/>
         </w:rPr>
-        <w:t>disponibilidad de APIs de grabación de audio y eventos de llamadas</w:t>
+        <w:t xml:space="preserve">disponibilidad de </w:t>
+      </w:r>
+      <w:proofErr w:type="spellStart"/>
+      <w:r>
+        <w:rPr>
+          <w:b/>
+          <w:bCs/>
+        </w:rPr>
+        <w:t>APIs</w:t>
+      </w:r>
+      <w:proofErr w:type="spellEnd"/>
+      <w:r>
+        <w:rPr>
+          <w:b/>
+          <w:bCs/>
+        </w:rPr>
+        <w:t xml:space="preserve"> de grabación de audio y eventos de llamadas</w:t>
       </w:r>
       <w:r>
         <w:t xml:space="preserve"> en el dispositivo</w:t>
@@ -19180,8 +20388,18 @@
           <w:color w:val="FFFFFF" w:themeColor="background1"/>
           <w:highlight w:val="black"/>
         </w:rPr>
-        <w:t>/SavedCalls</w:t>
-      </w:r>
+        <w:t>/</w:t>
+      </w:r>
+      <w:proofErr w:type="spellStart"/>
+      <w:r>
+        <w:rPr>
+          <w:rFonts w:ascii="Consolas" w:hAnsi="Consolas"/>
+          <w:color w:val="FFFFFF" w:themeColor="background1"/>
+          <w:highlight w:val="black"/>
+        </w:rPr>
+        <w:t>SavedCalls</w:t>
+      </w:r>
+      <w:proofErr w:type="spellEnd"/>
       <w:r>
         <w:t>, configurable por el usuario.</w:t>
       </w:r>
@@ -19490,7 +20708,15 @@
         <w:jc w:val="both"/>
       </w:pPr>
       <w:r>
-        <w:t>El sistema no dependerá de servicios remotos, APIs externas ni servidores propios.</w:t>
+        <w:t xml:space="preserve">El sistema no dependerá de servicios remotos, </w:t>
+      </w:r>
+      <w:proofErr w:type="spellStart"/>
+      <w:r>
+        <w:t>APIs</w:t>
+      </w:r>
+      <w:proofErr w:type="spellEnd"/>
+      <w:r>
+        <w:t xml:space="preserve"> externas ni servidores propios.</w:t>
       </w:r>
     </w:p>
     <w:p>
@@ -19693,9 +20919,7 @@
     <w:p>
       <w:pPr>
         <w:pStyle w:val="Ttulo1"/>
-        <w:jc w:val="both"/>
         <w:rPr>
-          <w:caps w:val="0"/>
           <w:sz w:val="18"/>
           <w:szCs w:val="18"/>
           <w:lang w:eastAsia="es-ES"/>
@@ -19763,6 +20987,7 @@
       <w:r>
         <w:t xml:space="preserve">La aplicación </w:t>
       </w:r>
+      <w:proofErr w:type="spellStart"/>
       <w:r>
         <w:rPr>
           <w:b/>
@@ -19770,6 +20995,7 @@
         </w:rPr>
         <w:t>Mexus</w:t>
       </w:r>
+      <w:proofErr w:type="spellEnd"/>
       <w:r>
         <w:t xml:space="preserve"> ha sido diseñada bajo el principio de </w:t>
       </w:r>
@@ -19783,12 +21009,85 @@
       <w:r>
         <w:t xml:space="preserve"> (</w:t>
       </w:r>
+      <w:proofErr w:type="spellStart"/>
       <w:r>
         <w:rPr>
           <w:i/>
           <w:iCs/>
         </w:rPr>
-        <w:t>Privacy by Design &amp; Privacy by Default</w:t>
+        <w:t>Privacy</w:t>
+      </w:r>
+      <w:proofErr w:type="spellEnd"/>
+      <w:r>
+        <w:rPr>
+          <w:i/>
+          <w:iCs/>
+        </w:rPr>
+        <w:t xml:space="preserve"> </w:t>
+      </w:r>
+      <w:proofErr w:type="spellStart"/>
+      <w:r>
+        <w:rPr>
+          <w:i/>
+          <w:iCs/>
+        </w:rPr>
+        <w:t>by</w:t>
+      </w:r>
+      <w:proofErr w:type="spellEnd"/>
+      <w:r>
+        <w:rPr>
+          <w:i/>
+          <w:iCs/>
+        </w:rPr>
+        <w:t xml:space="preserve"> </w:t>
+      </w:r>
+      <w:proofErr w:type="spellStart"/>
+      <w:r>
+        <w:rPr>
+          <w:i/>
+          <w:iCs/>
+        </w:rPr>
+        <w:t>Design</w:t>
+      </w:r>
+      <w:proofErr w:type="spellEnd"/>
+      <w:r>
+        <w:rPr>
+          <w:i/>
+          <w:iCs/>
+        </w:rPr>
+        <w:t xml:space="preserve"> &amp; </w:t>
+      </w:r>
+      <w:proofErr w:type="spellStart"/>
+      <w:r>
+        <w:rPr>
+          <w:i/>
+          <w:iCs/>
+        </w:rPr>
+        <w:t>Privacy</w:t>
+      </w:r>
+      <w:proofErr w:type="spellEnd"/>
+      <w:r>
+        <w:rPr>
+          <w:i/>
+          <w:iCs/>
+        </w:rPr>
+        <w:t xml:space="preserve"> </w:t>
+      </w:r>
+      <w:proofErr w:type="spellStart"/>
+      <w:r>
+        <w:rPr>
+          <w:i/>
+          <w:iCs/>
+        </w:rPr>
+        <w:t>by</w:t>
+      </w:r>
+      <w:proofErr w:type="spellEnd"/>
+      <w:r>
+        <w:rPr>
+          <w:i/>
+          <w:iCs/>
+        </w:rPr>
+        <w:t xml:space="preserve"> Default</w:t>
       </w:r>
       <w:r>
         <w:t>, RGPD art. 25), cumpliendo los siguientes criterios:</w:t>
@@ -20164,7 +21463,15 @@
         <w:t>aceptación explícita</w:t>
       </w:r>
       <w:r>
-        <w:t xml:space="preserve"> por parte del usuario (checkbox o mecanismo equivalente) donde se indique claramente esta responsabilidad antes del primer uso.</w:t>
+        <w:t xml:space="preserve"> por parte del usuario (</w:t>
+      </w:r>
+      <w:proofErr w:type="spellStart"/>
+      <w:r>
+        <w:t>checkbox</w:t>
+      </w:r>
+      <w:proofErr w:type="spellEnd"/>
+      <w:r>
+        <w:t xml:space="preserve"> o mecanismo equivalente) donde se indique claramente esta responsabilidad antes del primer uso.</w:t>
       </w:r>
     </w:p>
     <w:p>
@@ -20188,6 +21495,7 @@
       <w:pPr>
         <w:jc w:val="both"/>
       </w:pPr>
+      <w:proofErr w:type="spellStart"/>
       <w:r>
         <w:rPr>
           <w:b/>
@@ -20195,6 +21503,7 @@
         </w:rPr>
         <w:t>Mexus</w:t>
       </w:r>
+      <w:proofErr w:type="spellEnd"/>
       <w:r>
         <w:t xml:space="preserve"> se distribuye como una </w:t>
       </w:r>
@@ -20483,12 +21792,53 @@
       <w:r>
         <w:t xml:space="preserve">Principios de </w:t>
       </w:r>
+      <w:proofErr w:type="spellStart"/>
       <w:r>
         <w:rPr>
           <w:b/>
           <w:bCs/>
         </w:rPr>
-        <w:t>Privacy by Design / Default</w:t>
+        <w:t>Privacy</w:t>
+      </w:r>
+      <w:proofErr w:type="spellEnd"/>
+      <w:r>
+        <w:rPr>
+          <w:b/>
+          <w:bCs/>
+        </w:rPr>
+        <w:t xml:space="preserve"> </w:t>
+      </w:r>
+      <w:proofErr w:type="spellStart"/>
+      <w:r>
+        <w:rPr>
+          <w:b/>
+          <w:bCs/>
+        </w:rPr>
+        <w:t>by</w:t>
+      </w:r>
+      <w:proofErr w:type="spellEnd"/>
+      <w:r>
+        <w:rPr>
+          <w:b/>
+          <w:bCs/>
+        </w:rPr>
+        <w:t xml:space="preserve"> </w:t>
+      </w:r>
+      <w:proofErr w:type="spellStart"/>
+      <w:r>
+        <w:rPr>
+          <w:b/>
+          <w:bCs/>
+        </w:rPr>
+        <w:t>Design</w:t>
+      </w:r>
+      <w:proofErr w:type="spellEnd"/>
+      <w:r>
+        <w:rPr>
+          <w:b/>
+          <w:bCs/>
+        </w:rPr>
+        <w:t xml:space="preserve"> / Default</w:t>
       </w:r>
     </w:p>
     <w:p>
@@ -21786,8 +23136,21 @@
         <w:jc w:val="both"/>
       </w:pPr>
       <w:r>
-        <w:t>Android nativo: Recorder / AudioManager</w:t>
-      </w:r>
+        <w:t xml:space="preserve">Android nativo: </w:t>
+      </w:r>
+      <w:proofErr w:type="spellStart"/>
+      <w:r>
+        <w:t>Recorder</w:t>
+      </w:r>
+      <w:proofErr w:type="spellEnd"/>
+      <w:r>
+        <w:t xml:space="preserve"> / </w:t>
+      </w:r>
+      <w:proofErr w:type="spellStart"/>
+      <w:r>
+        <w:t>AudioManager</w:t>
+      </w:r>
+      <w:proofErr w:type="spellEnd"/>
     </w:p>
     <w:p>
       <w:pPr>
@@ -22097,7 +23460,6 @@
       <w:pPr>
         <w:pStyle w:val="Ttulo1"/>
         <w:rPr>
-          <w:caps w:val="0"/>
           <w:sz w:val="18"/>
           <w:szCs w:val="18"/>
           <w:lang w:eastAsia="es-ES"/>
@@ -22159,6 +23521,7 @@
       <w:r>
         <w:t xml:space="preserve">El sistema </w:t>
       </w:r>
+      <w:proofErr w:type="spellStart"/>
       <w:r>
         <w:rPr>
           <w:b/>
@@ -22166,6 +23529,7 @@
         </w:rPr>
         <w:t>Mexus</w:t>
       </w:r>
+      <w:proofErr w:type="spellEnd"/>
       <w:r>
         <w:t xml:space="preserve"> se considerará aceptado para la </w:t>
       </w:r>
@@ -23099,7 +24463,15 @@
         <w:jc w:val="both"/>
       </w:pPr>
       <w:r>
-        <w:t>Sincronización, backup o almacenamiento en la nube.</w:t>
+        <w:t xml:space="preserve">Sincronización, </w:t>
+      </w:r>
+      <w:proofErr w:type="spellStart"/>
+      <w:r>
+        <w:t>backup</w:t>
+      </w:r>
+      <w:proofErr w:type="spellEnd"/>
+      <w:r>
+        <w:t xml:space="preserve"> o almacenamiento en la nube.</w:t>
       </w:r>
     </w:p>
     <w:p>
@@ -23111,7 +24483,15 @@
         <w:jc w:val="both"/>
       </w:pPr>
       <w:r>
-        <w:t>Integración con servicios externos o APIs de terceros.</w:t>
+        <w:t xml:space="preserve">Integración con servicios externos o </w:t>
+      </w:r>
+      <w:proofErr w:type="spellStart"/>
+      <w:r>
+        <w:t>APIs</w:t>
+      </w:r>
+      <w:proofErr w:type="spellEnd"/>
+      <w:r>
+        <w:t xml:space="preserve"> de terceros.</w:t>
       </w:r>
     </w:p>
     <w:p>
@@ -23281,7 +24661,6 @@
       <w:pPr>
         <w:pStyle w:val="Ttulo1"/>
         <w:rPr>
-          <w:caps w:val="0"/>
           <w:sz w:val="18"/>
           <w:szCs w:val="18"/>
           <w:lang w:eastAsia="es-ES"/>
@@ -23404,9 +24783,11 @@
             <w:pPr>
               <w:jc w:val="left"/>
             </w:pPr>
+            <w:proofErr w:type="spellStart"/>
             <w:r>
               <w:t>Mexus</w:t>
             </w:r>
+            <w:proofErr w:type="spellEnd"/>
           </w:p>
         </w:tc>
         <w:tc>
@@ -23454,7 +24835,23 @@
               <w:cnfStyle w:val="000000000000" w:firstRow="0" w:lastRow="0" w:firstColumn="0" w:lastColumn="0" w:oddVBand="0" w:evenVBand="0" w:oddHBand="0" w:evenHBand="0" w:firstRowFirstColumn="0" w:firstRowLastColumn="0" w:lastRowFirstColumn="0" w:lastRowLastColumn="0"/>
             </w:pPr>
             <w:r>
-              <w:t>Software Requirements Specification. Documento formal de requisitos del sistema.</w:t>
+              <w:t xml:space="preserve">Software </w:t>
+            </w:r>
+            <w:proofErr w:type="spellStart"/>
+            <w:r>
+              <w:t>Requirements</w:t>
+            </w:r>
+            <w:proofErr w:type="spellEnd"/>
+            <w:r>
+              <w:t xml:space="preserve"> </w:t>
+            </w:r>
+            <w:proofErr w:type="spellStart"/>
+            <w:r>
+              <w:t>Specification</w:t>
+            </w:r>
+            <w:proofErr w:type="spellEnd"/>
+            <w:r>
+              <w:t>. Documento formal de requisitos del sistema.</w:t>
             </w:r>
           </w:p>
         </w:tc>
@@ -23488,11 +24885,47 @@
             <w:pPr>
               <w:cnfStyle w:val="000000100000" w:firstRow="0" w:lastRow="0" w:firstColumn="0" w:lastColumn="0" w:oddVBand="0" w:evenVBand="0" w:oddHBand="1" w:evenHBand="0" w:firstRowFirstColumn="0" w:firstRowLastColumn="0" w:lastRowFirstColumn="0" w:lastRowLastColumn="0"/>
             </w:pPr>
+            <w:proofErr w:type="spellStart"/>
             <w:r>
               <w:rPr>
                 <w:color w:val="FFFFFF" w:themeColor="background1"/>
               </w:rPr>
-              <w:t>Initial Functional Requirement. Identificador de requisitos funcionales.</w:t>
+              <w:t>Initial</w:t>
+            </w:r>
+            <w:proofErr w:type="spellEnd"/>
+            <w:r>
+              <w:rPr>
+                <w:color w:val="FFFFFF" w:themeColor="background1"/>
+              </w:rPr>
+              <w:t xml:space="preserve"> </w:t>
+            </w:r>
+            <w:proofErr w:type="spellStart"/>
+            <w:r>
+              <w:rPr>
+                <w:color w:val="FFFFFF" w:themeColor="background1"/>
+              </w:rPr>
+              <w:t>Functional</w:t>
+            </w:r>
+            <w:proofErr w:type="spellEnd"/>
+            <w:r>
+              <w:rPr>
+                <w:color w:val="FFFFFF" w:themeColor="background1"/>
+              </w:rPr>
+              <w:t xml:space="preserve"> </w:t>
+            </w:r>
+            <w:proofErr w:type="spellStart"/>
+            <w:r>
+              <w:rPr>
+                <w:color w:val="FFFFFF" w:themeColor="background1"/>
+              </w:rPr>
+              <w:t>Requirement</w:t>
+            </w:r>
+            <w:proofErr w:type="spellEnd"/>
+            <w:r>
+              <w:rPr>
+                <w:color w:val="FFFFFF" w:themeColor="background1"/>
+              </w:rPr>
+              <w:t>. Identificador de requisitos funcionales.</w:t>
             </w:r>
           </w:p>
         </w:tc>
@@ -23522,8 +24955,29 @@
             <w:pPr>
               <w:cnfStyle w:val="000000000000" w:firstRow="0" w:lastRow="0" w:firstColumn="0" w:lastColumn="0" w:oddVBand="0" w:evenVBand="0" w:oddHBand="0" w:evenHBand="0" w:firstRowFirstColumn="0" w:firstRowLastColumn="0" w:lastRowFirstColumn="0" w:lastRowLastColumn="0"/>
             </w:pPr>
+            <w:proofErr w:type="spellStart"/>
             <w:r>
-              <w:t>Initial Non-Functional Requirement. Identificador de requisitos no funcionales.</w:t>
+              <w:t>Initial</w:t>
+            </w:r>
+            <w:proofErr w:type="spellEnd"/>
+            <w:r>
+              <w:t xml:space="preserve"> Non-</w:t>
+            </w:r>
+            <w:proofErr w:type="spellStart"/>
+            <w:r>
+              <w:t>Functional</w:t>
+            </w:r>
+            <w:proofErr w:type="spellEnd"/>
+            <w:r>
+              <w:t xml:space="preserve"> </w:t>
+            </w:r>
+            <w:proofErr w:type="spellStart"/>
+            <w:r>
+              <w:t>Requirement</w:t>
+            </w:r>
+            <w:proofErr w:type="spellEnd"/>
+            <w:r>
+              <w:t>. Identificador de requisitos no funcionales.</w:t>
             </w:r>
           </w:p>
         </w:tc>
@@ -23557,11 +25011,33 @@
             <w:pPr>
               <w:cnfStyle w:val="000000100000" w:firstRow="0" w:lastRow="0" w:firstColumn="0" w:lastColumn="0" w:oddVBand="0" w:evenVBand="0" w:oddHBand="1" w:evenHBand="0" w:firstRowFirstColumn="0" w:firstRowLastColumn="0" w:lastRowFirstColumn="0" w:lastRowLastColumn="0"/>
             </w:pPr>
+            <w:proofErr w:type="spellStart"/>
             <w:r>
               <w:rPr>
                 <w:color w:val="FFFFFF" w:themeColor="background1"/>
               </w:rPr>
-              <w:t>Minimum Viable Product. Versión mínima del producto con valor funcional verificable.</w:t>
+              <w:t>Minimum</w:t>
+            </w:r>
+            <w:proofErr w:type="spellEnd"/>
+            <w:r>
+              <w:rPr>
+                <w:color w:val="FFFFFF" w:themeColor="background1"/>
+              </w:rPr>
+              <w:t xml:space="preserve"> Viable </w:t>
+            </w:r>
+            <w:proofErr w:type="spellStart"/>
+            <w:r>
+              <w:rPr>
+                <w:color w:val="FFFFFF" w:themeColor="background1"/>
+              </w:rPr>
+              <w:t>Product</w:t>
+            </w:r>
+            <w:proofErr w:type="spellEnd"/>
+            <w:r>
+              <w:rPr>
+                <w:color w:val="FFFFFF" w:themeColor="background1"/>
+              </w:rPr>
+              <w:t>. Versión mínima del producto con valor funcional verificable.</w:t>
             </w:r>
           </w:p>
         </w:tc>
@@ -23592,7 +25068,31 @@
               <w:cnfStyle w:val="000000000000" w:firstRow="0" w:lastRow="0" w:firstColumn="0" w:lastColumn="0" w:oddVBand="0" w:evenVBand="0" w:oddHBand="0" w:evenHBand="0" w:firstRowFirstColumn="0" w:firstRowLastColumn="0" w:lastRowFirstColumn="0" w:lastRowLastColumn="0"/>
             </w:pPr>
             <w:r>
-              <w:t>Método de priorización de requisitos: Must, Should, Could, Won’t.</w:t>
+              <w:t xml:space="preserve">Método de priorización de requisitos: Must, </w:t>
+            </w:r>
+            <w:proofErr w:type="spellStart"/>
+            <w:r>
+              <w:t>Should</w:t>
+            </w:r>
+            <w:proofErr w:type="spellEnd"/>
+            <w:r>
+              <w:t xml:space="preserve">, </w:t>
+            </w:r>
+            <w:proofErr w:type="spellStart"/>
+            <w:r>
+              <w:t>Could</w:t>
+            </w:r>
+            <w:proofErr w:type="spellEnd"/>
+            <w:r>
+              <w:t xml:space="preserve">, </w:t>
+            </w:r>
+            <w:proofErr w:type="spellStart"/>
+            <w:r>
+              <w:t>Won’t</w:t>
+            </w:r>
+            <w:proofErr w:type="spellEnd"/>
+            <w:r>
+              <w:t>.</w:t>
             </w:r>
           </w:p>
         </w:tc>
@@ -23680,9 +25180,11 @@
             <w:pPr>
               <w:jc w:val="left"/>
             </w:pPr>
+            <w:proofErr w:type="spellStart"/>
             <w:r>
               <w:t>Ionic</w:t>
             </w:r>
+            <w:proofErr w:type="spellEnd"/>
           </w:p>
         </w:tc>
         <w:tc>
@@ -23730,7 +25232,15 @@
               <w:cnfStyle w:val="000000000000" w:firstRow="0" w:lastRow="0" w:firstColumn="0" w:lastColumn="0" w:oddVBand="0" w:evenVBand="0" w:oddHBand="0" w:evenHBand="0" w:firstRowFirstColumn="0" w:firstRowLastColumn="0" w:lastRowFirstColumn="0" w:lastRowLastColumn="0"/>
             </w:pPr>
             <w:r>
-              <w:t>Framework frontend para aplicaciones web y móviles.</w:t>
+              <w:t xml:space="preserve">Framework </w:t>
+            </w:r>
+            <w:proofErr w:type="spellStart"/>
+            <w:r>
+              <w:t>frontend</w:t>
+            </w:r>
+            <w:proofErr w:type="spellEnd"/>
+            <w:r>
+              <w:t xml:space="preserve"> para aplicaciones web y móviles.</w:t>
             </w:r>
           </w:p>
         </w:tc>
@@ -23764,11 +25274,33 @@
             <w:pPr>
               <w:cnfStyle w:val="000000100000" w:firstRow="0" w:lastRow="0" w:firstColumn="0" w:lastColumn="0" w:oddVBand="0" w:evenVBand="0" w:oddHBand="1" w:evenHBand="0" w:firstRowFirstColumn="0" w:firstRowLastColumn="0" w:lastRowFirstColumn="0" w:lastRowLastColumn="0"/>
             </w:pPr>
+            <w:proofErr w:type="spellStart"/>
             <w:r>
               <w:rPr>
                 <w:color w:val="FFFFFF" w:themeColor="background1"/>
               </w:rPr>
-              <w:t>Runtime que permite el acceso a APIs nativas desde código web.</w:t>
+              <w:t>Runtime</w:t>
+            </w:r>
+            <w:proofErr w:type="spellEnd"/>
+            <w:r>
+              <w:rPr>
+                <w:color w:val="FFFFFF" w:themeColor="background1"/>
+              </w:rPr>
+              <w:t xml:space="preserve"> que permite el acceso a </w:t>
+            </w:r>
+            <w:proofErr w:type="spellStart"/>
+            <w:r>
+              <w:rPr>
+                <w:color w:val="FFFFFF" w:themeColor="background1"/>
+              </w:rPr>
+              <w:t>APIs</w:t>
+            </w:r>
+            <w:proofErr w:type="spellEnd"/>
+            <w:r>
+              <w:rPr>
+                <w:color w:val="FFFFFF" w:themeColor="background1"/>
+              </w:rPr>
+              <w:t xml:space="preserve"> nativas desde código web.</w:t>
             </w:r>
           </w:p>
         </w:tc>
@@ -23818,9 +25350,11 @@
             <w:pPr>
               <w:jc w:val="left"/>
             </w:pPr>
+            <w:proofErr w:type="spellStart"/>
             <w:r>
               <w:t>CallState</w:t>
             </w:r>
+            <w:proofErr w:type="spellEnd"/>
           </w:p>
         </w:tc>
         <w:tc>
@@ -23853,9 +25387,11 @@
             <w:pPr>
               <w:jc w:val="left"/>
             </w:pPr>
+            <w:proofErr w:type="spellStart"/>
             <w:r>
               <w:t>Recorder</w:t>
             </w:r>
+            <w:proofErr w:type="spellEnd"/>
           </w:p>
         </w:tc>
         <w:tc>
@@ -23899,7 +25435,15 @@
         </w:numPr>
       </w:pPr>
       <w:r>
-        <w:t>La aplicación se apoya en APIs públicas de Android disponibles a partir de la versión mínima soportada.</w:t>
+        <w:t xml:space="preserve">La aplicación se apoya en </w:t>
+      </w:r>
+      <w:proofErr w:type="spellStart"/>
+      <w:r>
+        <w:t>APIs</w:t>
+      </w:r>
+      <w:proofErr w:type="spellEnd"/>
+      <w:r>
+        <w:t xml:space="preserve"> públicas de Android disponibles a partir de la versión mínima soportada.</w:t>
       </w:r>
     </w:p>
     <w:p>
@@ -23937,7 +25481,15 @@
         <w:jc w:val="both"/>
       </w:pPr>
       <w:r>
-        <w:t>Interfaz (Ionic / Angular)</w:t>
+        <w:t>Interfaz (</w:t>
+      </w:r>
+      <w:proofErr w:type="spellStart"/>
+      <w:r>
+        <w:t>Ionic</w:t>
+      </w:r>
+      <w:proofErr w:type="spellEnd"/>
+      <w:r>
+        <w:t xml:space="preserve"> / Angular)</w:t>
       </w:r>
     </w:p>
     <w:p>
@@ -23969,7 +25521,15 @@
         <w:jc w:val="both"/>
       </w:pPr>
       <w:r>
-        <w:t>Integración nativa (plugins Capacitor en Java)</w:t>
+        <w:t>Integración nativa (</w:t>
+      </w:r>
+      <w:proofErr w:type="spellStart"/>
+      <w:r>
+        <w:t>plugins</w:t>
+      </w:r>
+      <w:proofErr w:type="spellEnd"/>
+      <w:r>
+        <w:t xml:space="preserve"> Capacitor en Java)</w:t>
       </w:r>
     </w:p>
     <w:p>
@@ -24066,7 +25626,6 @@
     <w:p>
       <w:pPr>
         <w:pStyle w:val="Ttulo1"/>
-        <w:jc w:val="both"/>
       </w:pPr>
       <w:r>
         <w:t>APROBACIÓN</w:t>
@@ -24074,7 +25633,6 @@
       <w:r>
         <w:rPr>
           <w:rFonts w:cs="Calibri Light"/>
-          <w:caps w:val="0"/>
           <w:sz w:val="18"/>
           <w:szCs w:val="18"/>
         </w:rPr>
@@ -24257,18 +25815,11 @@
     <w:p>
       <w:pPr>
         <w:pStyle w:val="Ttulo1"/>
-        <w:jc w:val="both"/>
       </w:pPr>
       <w:bookmarkStart w:id="102" w:name="_ESTADO_DEL_DOCUMENTO"/>
       <w:bookmarkEnd w:id="102"/>
       <w:r>
-        <w:t>ESTADO DEL DOCUMENTO</w:t>
-      </w:r>
-      <w:r>
-        <w:rPr>
-          <w:caps w:val="0"/>
-        </w:rPr>
-        <w:t xml:space="preserve"> </w:t>
+        <w:t xml:space="preserve">ESTADO DEL DOCUMENTO </w:t>
       </w:r>
       <w:hyperlink w:anchor="_ÍNDICE" w:history="1">
         <w:r>
@@ -24827,6 +26378,7 @@
               <w:i/>
             </w:rPr>
           </w:pPr>
+          <w:proofErr w:type="spellStart"/>
           <w:r>
             <w:rPr>
               <w:b/>
@@ -24835,6 +26387,7 @@
             </w:rPr>
             <w:t>Mexus</w:t>
           </w:r>
+          <w:proofErr w:type="spellEnd"/>
         </w:p>
       </w:tc>
     </w:tr>
@@ -54795,11 +56348,11 @@
     <w:autoRedefine/>
     <w:uiPriority w:val="4"/>
     <w:qFormat/>
-    <w:rsid w:val="00090481"/>
+    <w:rsid w:val="002E14D7"/>
     <w:pPr>
       <w:keepNext/>
       <w:shd w:val="solid" w:color="4E91CD" w:fill="FFFFFF" w:themeFill="background1"/>
-      <w:ind w:firstLine="720"/>
+      <w:ind w:firstLine="357"/>
       <w:outlineLvl w:val="0"/>
     </w:pPr>
     <w:rPr>
@@ -55029,7 +56582,7 @@
     <w:basedOn w:val="Fuentedeprrafopredeter"/>
     <w:link w:val="Ttulo1"/>
     <w:uiPriority w:val="4"/>
-    <w:rsid w:val="00090481"/>
+    <w:rsid w:val="002E14D7"/>
     <w:rPr>
       <w:rFonts w:ascii="Calibri Light" w:eastAsiaTheme="majorEastAsia" w:hAnsi="Calibri Light" w:cstheme="majorBidi"/>
       <w:caps/>
@@ -56570,6 +58123,7 @@
     <w:rsid w:val="000A3EFC"/>
     <w:rsid w:val="00115480"/>
     <w:rsid w:val="00130F2A"/>
+    <w:rsid w:val="001E255B"/>
     <w:rsid w:val="00204B26"/>
     <w:rsid w:val="0023140F"/>
     <w:rsid w:val="002C5662"/>
@@ -56581,9 +58135,12 @@
     <w:rsid w:val="00651E5D"/>
     <w:rsid w:val="006B176B"/>
     <w:rsid w:val="006E4AAA"/>
+    <w:rsid w:val="007C7E7F"/>
     <w:rsid w:val="00815D96"/>
     <w:rsid w:val="00960C1A"/>
     <w:rsid w:val="009C563C"/>
+    <w:rsid w:val="009E54CB"/>
+    <w:rsid w:val="00A31127"/>
     <w:rsid w:val="00C04831"/>
     <w:rsid w:val="00C94860"/>
     <w:rsid w:val="00C974A8"/>

</xml_diff>